<commit_message>
docs: manual updated for v13.1.0 merge (JK battery type 60)
</commit_message>
<xml_diff>
--- a/JK-Active-Balancer-Manual-v13.docx
+++ b/JK-Active-Balancer-Manual-v13.docx
@@ -20,7 +20,7 @@
     </w:p>
     <w:p>
       <w:r>
-        <w:t>Firmware: Battery-Emulator v13 with the JK Active Balancer port (git branch jk-active-balancer). Target board: LilyGo T-2CAN (ESP32-S3). Manual date: 8 October 2026.</w:t>
+        <w:t>Firmware: Battery-Emulator v13.1.0 with the JK Active Balancer port (git branch jk-active-balancer). Target board: LilyGo T-2CAN (ESP32-S3). Manual date: 9 October 2026.</w:t>
       </w:r>
     </w:p>
     <w:p>
@@ -7673,7 +7673,7 @@
               <w:rPr>
                 <w:sz w:val="19"/>
               </w:rPr>
-              <w:t>v13 common settings (battery type 59 = JK Active Balancer)</w:t>
+              <w:t>v13 common settings (battery type 60 = JK Active Balancer)</w:t>
             </w:r>
           </w:p>
         </w:tc>

</xml_diff>

<commit_message>
docs: CAB500 variant setting in the manual
</commit_message>
<xml_diff>
--- a/JK-Active-Balancer-Manual-v13.docx
+++ b/JK-Active-Balancer-Manual-v13.docx
@@ -1570,7 +1570,7 @@
         </w:numPr>
       </w:pPr>
       <w:r>
-        <w:t>CAB500 current sensor: same bus as the balancers. It sends ID 0x3C2 (11-bit), 8 bytes, every 10 ms; the current is in bytes 0-3 as milliamps with an offset of 0x80000000, byte 4 holds the error flags. Readings beyond plus or minus 600 A are discarded as power-up artefacts.</w:t>
+        <w:t>CAB500 current sensor: same bus as the balancers. It sends its variant's ID (0x3C2 for the -2, selectable on the Settings page), 11-bit, 8 bytes, every 10 ms; the current is in bytes 0-3 as milliamps with an offset of 0x80000000, byte 4 holds the error flags. Readings beyond plus or minus 600 A are discarded as power-up artefacts.</w:t>
       </w:r>
     </w:p>
     <w:p>
@@ -3633,6 +3633,72 @@
           </w:p>
         </w:tc>
       </w:tr>
+      <w:tr>
+        <w:tc>
+          <w:tcPr>
+            <w:tcW w:type="dxa" w:w="2400"/>
+          </w:tcPr>
+          <w:p>
+            <w:pPr>
+              <w:spacing w:before="20" w:after="20"/>
+            </w:pPr>
+            <w:r>
+              <w:rPr>
+                <w:sz w:val="19"/>
+              </w:rPr>
+              <w:t>CAB500 variant (CAN frame ID)</w:t>
+            </w:r>
+          </w:p>
+        </w:tc>
+        <w:tc>
+          <w:tcPr>
+            <w:tcW w:type="dxa" w:w="1300"/>
+          </w:tcPr>
+          <w:p>
+            <w:pPr>
+              <w:spacing w:before="20" w:after="20"/>
+            </w:pPr>
+            <w:r>
+              <w:rPr>
+                <w:sz w:val="19"/>
+              </w:rPr>
+              <w:t>CAB500-2 (0x3C2)</w:t>
+            </w:r>
+          </w:p>
+        </w:tc>
+        <w:tc>
+          <w:tcPr>
+            <w:tcW w:type="dxa" w:w="1500"/>
+          </w:tcPr>
+          <w:p>
+            <w:pPr>
+              <w:spacing w:before="20" w:after="20"/>
+            </w:pPr>
+            <w:r>
+              <w:rPr>
+                <w:sz w:val="19"/>
+              </w:rPr>
+              <w:t>-1, -2, -3, -4, -5, -9</w:t>
+            </w:r>
+          </w:p>
+        </w:tc>
+        <w:tc>
+          <w:tcPr>
+            <w:tcW w:type="dxa" w:w="3826"/>
+          </w:tcPr>
+          <w:p>
+            <w:pPr>
+              <w:spacing w:before="20" w:after="20"/>
+            </w:pPr>
+            <w:r>
+              <w:rPr>
+                <w:sz w:val="19"/>
+              </w:rPr>
+              <w:t>Which variant is fitted; the number printed on the sensor sets the CAN ID it transmits on: -1 = 0x3C1, -2 = 0x3C2, -3 = 0x3C3, -4 = 0x3C4, -5 = 0x3C5, -9 = 0x3C0. The More battery info block shows the ID in use.</w:t>
+            </w:r>
+          </w:p>
+        </w:tc>
+      </w:tr>
     </w:tbl>
     <w:p/>
     <w:p>
@@ -7093,7 +7159,7 @@
               <w:rPr>
                 <w:sz w:val="19"/>
               </w:rPr>
-              <w:t>not reversed</w:t>
+              <w:t>not reversed, CAB500-2 (frame ID 0x3C2)</w:t>
             </w:r>
           </w:p>
         </w:tc>
@@ -7504,6 +7570,40 @@
                 <w:sz w:val="19"/>
               </w:rPr>
               <w:t>Reverse current, LFP chemistry, low-voltage mode, bridge mode (bool)</w:t>
+            </w:r>
+          </w:p>
+        </w:tc>
+      </w:tr>
+      <w:tr>
+        <w:tc>
+          <w:tcPr>
+            <w:tcW w:type="dxa" w:w="3000"/>
+          </w:tcPr>
+          <w:p>
+            <w:pPr>
+              <w:spacing w:before="20" w:after="20"/>
+            </w:pPr>
+            <w:r>
+              <w:rPr>
+                <w:sz w:val="19"/>
+              </w:rPr>
+              <w:t>JKCABID</w:t>
+            </w:r>
+          </w:p>
+        </w:tc>
+        <w:tc>
+          <w:tcPr>
+            <w:tcW w:type="dxa" w:w="6026"/>
+          </w:tcPr>
+          <w:p>
+            <w:pPr>
+              <w:spacing w:before="20" w:after="20"/>
+            </w:pPr>
+            <w:r>
+              <w:rPr>
+                <w:sz w:val="19"/>
+              </w:rPr>
+              <w:t>CAB500 frame ID (962 = 0x3C2)</w:t>
             </w:r>
           </w:p>
         </w:tc>

</xml_diff>

<commit_message>
docs: second CAB500 ID, per-balancer voltage and SOC capacity lines in the manual
</commit_message>
<xml_diff>
--- a/JK-Active-Balancer-Manual-v13.docx
+++ b/JK-Active-Balancer-Manual-v13.docx
@@ -1109,7 +1109,7 @@
               <w:rPr>
                 <w:sz w:val="19"/>
               </w:rPr>
-              <w:t>Two JK packs on two CAN ports. Each pack needs its own CAB500 because both sensors transmit the same CAN ID. Both packs share the JK settings.</w:t>
+              <w:t>Two JK packs on two CAN ports, each with its own CAB500. Both packs share the JK settings except the CAB500 variant, which has a second dropdown.</w:t>
             </w:r>
           </w:p>
         </w:tc>
@@ -1656,7 +1656,7 @@
         </w:numPr>
       </w:pPr>
       <w:r>
-        <w:t>One block per balancer: Connected / Disconnected, temperature, balancing state, balance switch, maximum balance current, communication fault counter, cell count mismatch and wire resistance. Alarms show as ALARM (latched, reboot to clear).</w:t>
+        <w:t>One block per balancer: Connected / Disconnected, pack voltage (from the status frame on V11.56, summed from the cells on V11.55), temperature, balancing state, balance switch, maximum balance current, communication fault counter, cell count mismatch and wire resistance. Alarms show as ALARM (latched, reboot to clear).</w:t>
       </w:r>
     </w:p>
     <w:p>
@@ -1668,7 +1668,7 @@
         </w:numPr>
       </w:pPr>
       <w:r>
-        <w:t>CAB500 CT Sensor block: Connected, communication state, fault counter, hardware state with the DTC code (0x41 overcurrent, 0x42 reference voltage, 0x44 signal lost, 0x46 supply voltage), and the CAN speed change line (chapter 11).</w:t>
+        <w:t>CAB500 CT Sensor block: Connected, communication state, fault counter, hardware state with the DTC code (0x41 overcurrent, 0x42 reference voltage, 0x44 signal lost, 0x46 supply voltage), the CAN speed change line (chapter 11) and the capacity in Ah the coulomb counter divides by, next to the rated Ah from the Wh setting.</w:t>
       </w:r>
     </w:p>
     <w:p>
@@ -3699,6 +3699,72 @@
           </w:p>
         </w:tc>
       </w:tr>
+      <w:tr>
+        <w:tc>
+          <w:tcPr>
+            <w:tcW w:type="dxa" w:w="2400"/>
+          </w:tcPr>
+          <w:p>
+            <w:pPr>
+              <w:spacing w:before="20" w:after="20"/>
+            </w:pPr>
+            <w:r>
+              <w:rPr>
+                <w:sz w:val="19"/>
+              </w:rPr>
+              <w:t>Second battery CAB500 variant</w:t>
+            </w:r>
+          </w:p>
+        </w:tc>
+        <w:tc>
+          <w:tcPr>
+            <w:tcW w:type="dxa" w:w="1300"/>
+          </w:tcPr>
+          <w:p>
+            <w:pPr>
+              <w:spacing w:before="20" w:after="20"/>
+            </w:pPr>
+            <w:r>
+              <w:rPr>
+                <w:sz w:val="19"/>
+              </w:rPr>
+              <w:t>CAB500-2 (0x3C2)</w:t>
+            </w:r>
+          </w:p>
+        </w:tc>
+        <w:tc>
+          <w:tcPr>
+            <w:tcW w:type="dxa" w:w="1500"/>
+          </w:tcPr>
+          <w:p>
+            <w:pPr>
+              <w:spacing w:before="20" w:after="20"/>
+            </w:pPr>
+            <w:r>
+              <w:rPr>
+                <w:sz w:val="19"/>
+              </w:rPr>
+              <w:t>same</w:t>
+            </w:r>
+          </w:p>
+        </w:tc>
+        <w:tc>
+          <w:tcPr>
+            <w:tcW w:type="dxa" w:w="3826"/>
+          </w:tcPr>
+          <w:p>
+            <w:pPr>
+              <w:spacing w:before="20" w:after="20"/>
+            </w:pPr>
+            <w:r>
+              <w:rPr>
+                <w:sz w:val="19"/>
+              </w:rPr>
+              <w:t>Only shown while Second battery is ticked in the Battery config. The second pack has its own sensor on its own CAN interface and may be a different variant.</w:t>
+            </w:r>
+          </w:p>
+        </w:tc>
+      </w:tr>
     </w:tbl>
     <w:p/>
     <w:p>
@@ -7587,7 +7653,7 @@
               <w:rPr>
                 <w:sz w:val="19"/>
               </w:rPr>
-              <w:t>JKCABID</w:t>
+              <w:t>JKCABID, JKCABID2</w:t>
             </w:r>
           </w:p>
         </w:tc>
@@ -7603,7 +7669,7 @@
               <w:rPr>
                 <w:sz w:val="19"/>
               </w:rPr>
-              <w:t>CAB500 frame ID (962 = 0x3C2)</w:t>
+              <w:t>CAB500 frame ID of battery 1 and 2 (962 = 0x3C2)</w:t>
             </w:r>
           </w:p>
         </w:tc>

</xml_diff>

<commit_message>
docs: hardware chapter with parts list, pictures and wiring; 8.13 references removed (real change)
</commit_message>
<xml_diff>
--- a/JK-Active-Balancer-Manual-v13.docx
+++ b/JK-Active-Balancer-Manual-v13.docx
@@ -25,7 +25,7 @@
     </w:p>
     <w:p>
       <w:r>
-        <w:t>This manual is for the person who installs and configures the emulator with JK Active Balancers and a CAB500 current sensor. It explains where every setting lives, what it does, which values are safe, and how the firmware behaves when something goes wrong. Everything described here was verified on the bench with one balancer, two cells and a CAB500 during the port.</w:t>
+        <w:t>This manual is for the person who installs and configures the emulator with JK Active Balancers and a CAB500 current sensor. It explains where every setting lives, what it does, which values are safe, and how the firmware behaves when something goes wrong. Everything described here was verified on the bench with one balancer, two cells and a CAB500.</w:t>
       </w:r>
     </w:p>
     <w:p>
@@ -93,7 +93,7 @@
         </w:numPr>
       </w:pPr>
       <w:r>
-        <w:t>5. Hardware and CAN wiring (LilyGo T-2CAN)</w:t>
+        <w:t>5. Hardware, parts and wiring</w:t>
       </w:r>
     </w:p>
     <w:p>
@@ -230,6 +230,19 @@
     </w:p>
     <w:p>
       <w:pPr>
+        <w:pStyle w:val="Heading1"/>
+      </w:pPr>
+      <w:r>
+        <w:t>1. What the system does</w:t>
+      </w:r>
+    </w:p>
+    <w:p>
+      <w:r>
+        <w:t>The emulator sits between a DIY battery pack built with JK Active Balancers and a solar inverter. The inverter expects a commercial battery with a BMS; the emulator pretends to be one.</w:t>
+      </w:r>
+    </w:p>
+    <w:p>
+      <w:pPr>
         <w:pStyle w:val="ListParagraph"/>
         <w:numPr>
           <w:ilvl w:val="0"/>
@@ -237,20 +250,7 @@
         </w:numPr>
       </w:pPr>
       <w:r>
-        <w:t>Appendix D. Differences to the 8.13 firmware</w:t>
-      </w:r>
-    </w:p>
-    <w:p>
-      <w:pPr>
-        <w:pStyle w:val="Heading1"/>
-      </w:pPr>
-      <w:r>
-        <w:t>1. What the system does</w:t>
-      </w:r>
-    </w:p>
-    <w:p>
-      <w:r>
-        <w:t>The emulator sits between a DIY battery pack built with JK Active Balancers and a solar inverter. The inverter expects a commercial battery with a BMS; the emulator pretends to be one.</w:t>
+        <w:t>JK Active Balancers measure the cell voltages and the module temperature of each pack section and balance the cells. They report over CAN bus at 250 kbps. One balancer handles up to 24 cells, up to 15 balancers are polled.</w:t>
       </w:r>
     </w:p>
     <w:p>
@@ -262,7 +262,7 @@
         </w:numPr>
       </w:pPr>
       <w:r>
-        <w:t>JK Active Balancers measure the cell voltages and the module temperature of each pack section and balance the cells. They report over CAN bus at 250 kbps. One balancer handles up to 24 cells, up to 15 balancers are polled.</w:t>
+        <w:t>A CAB500 CAN current sensor measures the pack current: either a LEM CAB500-C/SP5 or an STB-CAB500M-22C (500 A, CAN). It is the only current sensor this firmware supports. New sensors ship at 500 kbps and must be set to 250 kbps once (chapter 11).</w:t>
       </w:r>
     </w:p>
     <w:p>
@@ -274,19 +274,7 @@
         </w:numPr>
       </w:pPr>
       <w:r>
-        <w:t>A CAB500 CAN current sensor measures the pack current. It is the only current sensor supported by this firmware; the analog CT of the 8.13 build is gone. New sensors ship at 500 kbps and must be set to 250 kbps once (chapter 11).</w:t>
-      </w:r>
-    </w:p>
-    <w:p>
-      <w:pPr>
-        <w:pStyle w:val="ListParagraph"/>
-        <w:numPr>
-          <w:ilvl w:val="0"/>
-          <w:numId w:val="1"/>
-        </w:numPr>
-      </w:pPr>
-      <w:r>
-        <w:t>The emulator (LilyGo T-2CAN) polls the balancers, reads the current sensor, calculates the state of charge (SOC) by coulomb counting, applies the protections and presents the battery to the inverter with the protocol chosen on the Settings page, for example BYD Battery-Box Premium HVS over CAN with the Deye workaround.</w:t>
+        <w:t>The emulator (LilyGo T-2CAN, ESP32-S3 with two CAN ports) polls the balancers, reads the current sensor, calculates the state of charge (SOC) by coulomb counting, applies the protections and presents the battery to the inverter with the protocol chosen on the Settings page, for example BYD Battery-Box Premium HVS over CAN with the Deye workaround.</w:t>
       </w:r>
     </w:p>
     <w:p>
@@ -1209,7 +1197,7 @@
               <w:rPr>
                 <w:sz w:val="19"/>
               </w:rPr>
-              <w:t>Inverter protocol and the other CAN port. BYD Battery-Box Premium HVS with the Deye option behaves as the 8.13 build did.</w:t>
+              <w:t>Inverter protocol and the other CAN port. BYD Battery-Box Premium HVS with the Deye option is the tested combination.</w:t>
             </w:r>
           </w:p>
         </w:tc>
@@ -1529,12 +1517,763 @@
         <w:pStyle w:val="Heading1"/>
       </w:pPr>
       <w:r>
-        <w:t>5. Hardware and CAN wiring (LilyGo T-2CAN)</w:t>
-      </w:r>
-    </w:p>
-    <w:p>
-      <w:r>
-        <w:t>The port uses the standard v13 pin assignment of the board; nothing was changed in the hardware layer. The T-2CAN has two CAN ports on board, a native one and an MCP2515, both with transceivers. The GPIO numbers are in the Battery-Emulator wiki for the board and in hw_lilygo2can.h.</w:t>
+        <w:t>5. Hardware, parts and wiring</w:t>
+      </w:r>
+    </w:p>
+    <w:p>
+      <w:pPr>
+        <w:pStyle w:val="Heading2"/>
+      </w:pPr>
+      <w:r>
+        <w:t>5.1 Parts</w:t>
+      </w:r>
+    </w:p>
+    <w:tbl>
+      <w:tblPr>
+        <w:tblStyle w:val="TableGrid"/>
+        <w:tblW w:type="auto" w:w="0"/>
+        <w:tblLayout w:type="fixed"/>
+        <w:tblLook w:firstColumn="1" w:firstRow="1" w:lastColumn="0" w:lastRow="0" w:noHBand="0" w:noVBand="1" w:val="04A0"/>
+        <w:tblLayout w:type="fixed"/>
+      </w:tblPr>
+      <w:tblGrid>
+        <w:gridCol w:w="3200"/>
+        <w:gridCol w:w="3400"/>
+        <w:gridCol w:w="2426"/>
+      </w:tblGrid>
+      <w:tr>
+        <w:trPr>
+          <w:tblHeader/>
+        </w:trPr>
+        <w:tc>
+          <w:tcPr>
+            <w:tcW w:type="dxa" w:w="3200"/>
+            <w:shd w:val="clear" w:color="auto" w:fill="1F3864"/>
+          </w:tcPr>
+          <w:p>
+            <w:pPr>
+              <w:spacing w:before="40" w:after="40"/>
+            </w:pPr>
+            <w:r>
+              <w:rPr>
+                <w:b/>
+                <w:color w:val="FFFFFF"/>
+                <w:sz w:val="19"/>
+              </w:rPr>
+              <w:t>Part</w:t>
+            </w:r>
+          </w:p>
+        </w:tc>
+        <w:tc>
+          <w:tcPr>
+            <w:tcW w:type="dxa" w:w="3400"/>
+            <w:shd w:val="clear" w:color="auto" w:fill="1F3864"/>
+          </w:tcPr>
+          <w:p>
+            <w:pPr>
+              <w:spacing w:before="40" w:after="40"/>
+            </w:pPr>
+            <w:r>
+              <w:rPr>
+                <w:b/>
+                <w:color w:val="FFFFFF"/>
+                <w:sz w:val="19"/>
+              </w:rPr>
+              <w:t>Used for</w:t>
+            </w:r>
+          </w:p>
+        </w:tc>
+        <w:tc>
+          <w:tcPr>
+            <w:tcW w:type="dxa" w:w="2426"/>
+            <w:shd w:val="clear" w:color="auto" w:fill="1F3864"/>
+          </w:tcPr>
+          <w:p>
+            <w:pPr>
+              <w:spacing w:before="40" w:after="40"/>
+            </w:pPr>
+            <w:r>
+              <w:rPr>
+                <w:b/>
+                <w:color w:val="FFFFFF"/>
+                <w:sz w:val="19"/>
+              </w:rPr>
+              <w:t>Where</w:t>
+            </w:r>
+          </w:p>
+        </w:tc>
+      </w:tr>
+      <w:tr>
+        <w:tc>
+          <w:tcPr>
+            <w:tcW w:type="dxa" w:w="3200"/>
+          </w:tcPr>
+          <w:p>
+            <w:pPr>
+              <w:spacing w:before="20" w:after="20"/>
+            </w:pPr>
+            <w:r>
+              <w:rPr>
+                <w:sz w:val="19"/>
+              </w:rPr>
+              <w:t>LilyGo T-2CAN (ESP32-S3, two CAN ports on board)</w:t>
+            </w:r>
+          </w:p>
+        </w:tc>
+        <w:tc>
+          <w:tcPr>
+            <w:tcW w:type="dxa" w:w="3400"/>
+          </w:tcPr>
+          <w:p>
+            <w:pPr>
+              <w:spacing w:before="20" w:after="20"/>
+            </w:pPr>
+            <w:r>
+              <w:rPr>
+                <w:sz w:val="19"/>
+              </w:rPr>
+              <w:t>The emulator. Runs Battery-Emulator v13 with the JK driver.</w:t>
+            </w:r>
+          </w:p>
+        </w:tc>
+        <w:tc>
+          <w:tcPr>
+            <w:tcW w:type="dxa" w:w="2426"/>
+          </w:tcPr>
+          <w:p>
+            <w:pPr>
+              <w:spacing w:before="20" w:after="20"/>
+            </w:pPr>
+            <w:r>
+              <w:rPr>
+                <w:sz w:val="19"/>
+              </w:rPr>
+              <w:t>LilyGo</w:t>
+            </w:r>
+          </w:p>
+        </w:tc>
+      </w:tr>
+      <w:tr>
+        <w:tc>
+          <w:tcPr>
+            <w:tcW w:type="dxa" w:w="3200"/>
+          </w:tcPr>
+          <w:p>
+            <w:pPr>
+              <w:spacing w:before="20" w:after="20"/>
+            </w:pPr>
+            <w:r>
+              <w:rPr>
+                <w:sz w:val="19"/>
+              </w:rPr>
+              <w:t>JIKONG JK-DZ08-B2A24S active balancer (2 A, 2 to 24 cells, built-in CAN and Bluetooth)</w:t>
+            </w:r>
+          </w:p>
+        </w:tc>
+        <w:tc>
+          <w:tcPr>
+            <w:tcW w:type="dxa" w:w="3400"/>
+          </w:tcPr>
+          <w:p>
+            <w:pPr>
+              <w:spacing w:before="20" w:after="20"/>
+            </w:pPr>
+            <w:r>
+              <w:rPr>
+                <w:sz w:val="19"/>
+              </w:rPr>
+              <w:t>One per group of up to 24 cells. Supply 24 to 70 V (label), balancing 0.1 to 2 A, 3 mV accuracy.</w:t>
+            </w:r>
+          </w:p>
+        </w:tc>
+        <w:tc>
+          <w:tcPr>
+            <w:tcW w:type="dxa" w:w="2426"/>
+          </w:tcPr>
+          <w:p>
+            <w:pPr>
+              <w:spacing w:before="20" w:after="20"/>
+            </w:pPr>
+            <w:r>
+              <w:rPr>
+                <w:sz w:val="19"/>
+              </w:rPr>
+              <w:t>aliexpress.com/item/1005008512834934.html</w:t>
+            </w:r>
+          </w:p>
+        </w:tc>
+      </w:tr>
+      <w:tr>
+        <w:tc>
+          <w:tcPr>
+            <w:tcW w:type="dxa" w:w="3200"/>
+          </w:tcPr>
+          <w:p>
+            <w:pPr>
+              <w:spacing w:before="20" w:after="20"/>
+            </w:pPr>
+            <w:r>
+              <w:rPr>
+                <w:sz w:val="19"/>
+              </w:rPr>
+              <w:t>Current sensor, one of: LEM CAB500-C/SP5 or STB-CAB500M-22C (500 A, CAN)</w:t>
+            </w:r>
+          </w:p>
+        </w:tc>
+        <w:tc>
+          <w:tcPr>
+            <w:tcW w:type="dxa" w:w="3400"/>
+          </w:tcPr>
+          <w:p>
+            <w:pPr>
+              <w:spacing w:before="20" w:after="20"/>
+            </w:pPr>
+            <w:r>
+              <w:rPr>
+                <w:sz w:val="19"/>
+              </w:rPr>
+              <w:t>Pack current for the coulomb counter. One per pack, on the pack's own CAN bus.</w:t>
+            </w:r>
+          </w:p>
+        </w:tc>
+        <w:tc>
+          <w:tcPr>
+            <w:tcW w:type="dxa" w:w="2426"/>
+          </w:tcPr>
+          <w:p>
+            <w:pPr>
+              <w:spacing w:before="20" w:after="20"/>
+            </w:pPr>
+            <w:r>
+              <w:rPr>
+                <w:sz w:val="19"/>
+              </w:rPr>
+              <w:t>LEM: mou.sr/4yPDbDp; STB: AliExpress, search STB-CAB500M-22C</w:t>
+            </w:r>
+          </w:p>
+        </w:tc>
+      </w:tr>
+      <w:tr>
+        <w:tc>
+          <w:tcPr>
+            <w:tcW w:type="dxa" w:w="3200"/>
+          </w:tcPr>
+          <w:p>
+            <w:pPr>
+              <w:spacing w:before="20" w:after="20"/>
+            </w:pPr>
+            <w:r>
+              <w:rPr>
+                <w:sz w:val="19"/>
+              </w:rPr>
+              <w:t>4-pin connector harness, TE 1612035-1 / 1473672-1 / 1123343-1</w:t>
+            </w:r>
+          </w:p>
+        </w:tc>
+        <w:tc>
+          <w:tcPr>
+            <w:tcW w:type="dxa" w:w="3400"/>
+          </w:tcPr>
+          <w:p>
+            <w:pPr>
+              <w:spacing w:before="20" w:after="20"/>
+            </w:pPr>
+            <w:r>
+              <w:rPr>
+                <w:sz w:val="19"/>
+              </w:rPr>
+              <w:t>Mates with the CAB500 socket (CAN-L, CAN-H, GND, Uc).</w:t>
+            </w:r>
+          </w:p>
+        </w:tc>
+        <w:tc>
+          <w:tcPr>
+            <w:tcW w:type="dxa" w:w="2426"/>
+          </w:tcPr>
+          <w:p>
+            <w:pPr>
+              <w:spacing w:before="20" w:after="20"/>
+            </w:pPr>
+            <w:r>
+              <w:rPr>
+                <w:sz w:val="19"/>
+              </w:rPr>
+              <w:t>a.aliexpress.com/_EzbfyR8</w:t>
+            </w:r>
+          </w:p>
+        </w:tc>
+      </w:tr>
+      <w:tr>
+        <w:tc>
+          <w:tcPr>
+            <w:tcW w:type="dxa" w:w="3200"/>
+          </w:tcPr>
+          <w:p>
+            <w:pPr>
+              <w:spacing w:before="20" w:after="20"/>
+            </w:pPr>
+            <w:r>
+              <w:rPr>
+                <w:sz w:val="19"/>
+              </w:rPr>
+              <w:t>Isolated DC-DC converter 12 V in, 24 V out, 15 W</w:t>
+            </w:r>
+          </w:p>
+        </w:tc>
+        <w:tc>
+          <w:tcPr>
+            <w:tcW w:type="dxa" w:w="3400"/>
+          </w:tcPr>
+          <w:p>
+            <w:pPr>
+              <w:spacing w:before="20" w:after="20"/>
+            </w:pPr>
+            <w:r>
+              <w:rPr>
+                <w:sz w:val="19"/>
+              </w:rPr>
+              <w:t>One per balancer, powers the balancer's PWR input from the 12 V supply.</w:t>
+            </w:r>
+          </w:p>
+        </w:tc>
+        <w:tc>
+          <w:tcPr>
+            <w:tcW w:type="dxa" w:w="2426"/>
+          </w:tcPr>
+          <w:p>
+            <w:pPr>
+              <w:spacing w:before="20" w:after="20"/>
+            </w:pPr>
+            <w:r>
+              <w:rPr>
+                <w:sz w:val="19"/>
+              </w:rPr>
+              <w:t>aliexpress.com/item/1005010265328330.html</w:t>
+            </w:r>
+          </w:p>
+        </w:tc>
+      </w:tr>
+      <w:tr>
+        <w:tc>
+          <w:tcPr>
+            <w:tcW w:type="dxa" w:w="3200"/>
+          </w:tcPr>
+          <w:p>
+            <w:pPr>
+              <w:spacing w:before="20" w:after="20"/>
+            </w:pPr>
+            <w:r>
+              <w:rPr>
+                <w:sz w:val="19"/>
+              </w:rPr>
+              <w:t>120 ohm resistor</w:t>
+            </w:r>
+          </w:p>
+        </w:tc>
+        <w:tc>
+          <w:tcPr>
+            <w:tcW w:type="dxa" w:w="3400"/>
+          </w:tcPr>
+          <w:p>
+            <w:pPr>
+              <w:spacing w:before="20" w:after="20"/>
+            </w:pPr>
+            <w:r>
+              <w:rPr>
+                <w:sz w:val="19"/>
+              </w:rPr>
+              <w:t>Far-end termination of the battery CAN bus (at the last balancer).</w:t>
+            </w:r>
+          </w:p>
+        </w:tc>
+        <w:tc>
+          <w:tcPr>
+            <w:tcW w:type="dxa" w:w="2426"/>
+          </w:tcPr>
+          <w:p>
+            <w:pPr>
+              <w:spacing w:before="20" w:after="20"/>
+            </w:pPr>
+            <w:r>
+              <w:rPr>
+                <w:sz w:val="19"/>
+              </w:rPr>
+              <w:t>any</w:t>
+            </w:r>
+          </w:p>
+        </w:tc>
+      </w:tr>
+      <w:tr>
+        <w:tc>
+          <w:tcPr>
+            <w:tcW w:type="dxa" w:w="3200"/>
+          </w:tcPr>
+          <w:p>
+            <w:pPr>
+              <w:spacing w:before="20" w:after="20"/>
+            </w:pPr>
+            <w:r>
+              <w:rPr>
+                <w:sz w:val="19"/>
+              </w:rPr>
+              <w:t>12 V supply</w:t>
+            </w:r>
+          </w:p>
+        </w:tc>
+        <w:tc>
+          <w:tcPr>
+            <w:tcW w:type="dxa" w:w="3400"/>
+          </w:tcPr>
+          <w:p>
+            <w:pPr>
+              <w:spacing w:before="20" w:after="20"/>
+            </w:pPr>
+            <w:r>
+              <w:rPr>
+                <w:sz w:val="19"/>
+              </w:rPr>
+              <w:t>Emulator, CAB500 Uc and the DC-DC converters.</w:t>
+            </w:r>
+          </w:p>
+        </w:tc>
+        <w:tc>
+          <w:tcPr>
+            <w:tcW w:type="dxa" w:w="2426"/>
+          </w:tcPr>
+          <w:p>
+            <w:pPr>
+              <w:spacing w:before="20" w:after="20"/>
+            </w:pPr>
+            <w:r>
+              <w:rPr>
+                <w:sz w:val="19"/>
+              </w:rPr>
+              <w:t>site specific</w:t>
+            </w:r>
+          </w:p>
+        </w:tc>
+      </w:tr>
+      <w:tr>
+        <w:tc>
+          <w:tcPr>
+            <w:tcW w:type="dxa" w:w="3200"/>
+          </w:tcPr>
+          <w:p>
+            <w:pPr>
+              <w:spacing w:before="20" w:after="20"/>
+            </w:pPr>
+            <w:r>
+              <w:rPr>
+                <w:sz w:val="19"/>
+              </w:rPr>
+              <w:t>Contactors, precharge resistor, fuses, cabling</w:t>
+            </w:r>
+          </w:p>
+        </w:tc>
+        <w:tc>
+          <w:tcPr>
+            <w:tcW w:type="dxa" w:w="3400"/>
+          </w:tcPr>
+          <w:p>
+            <w:pPr>
+              <w:spacing w:before="20" w:after="20"/>
+            </w:pPr>
+            <w:r>
+              <w:rPr>
+                <w:sz w:val="19"/>
+              </w:rPr>
+              <w:t>As for any Battery-Emulator installation; see the Battery-Emulator wiki.</w:t>
+            </w:r>
+          </w:p>
+        </w:tc>
+        <w:tc>
+          <w:tcPr>
+            <w:tcW w:type="dxa" w:w="2426"/>
+          </w:tcPr>
+          <w:p>
+            <w:pPr>
+              <w:spacing w:before="20" w:after="20"/>
+            </w:pPr>
+            <w:r>
+              <w:rPr>
+                <w:sz w:val="19"/>
+              </w:rPr>
+              <w:t>site specific</w:t>
+            </w:r>
+          </w:p>
+        </w:tc>
+      </w:tr>
+    </w:tbl>
+    <w:p/>
+    <w:p>
+      <w:pPr>
+        <w:jc w:val="center"/>
+      </w:pPr>
+      <w:r>
+        <w:drawing>
+          <wp:inline xmlns:wp="http://schemas.openxmlformats.org/drawingml/2006/wordprocessingDrawing" xmlns:a="http://schemas.openxmlformats.org/drawingml/2006/main" xmlns:pic="http://schemas.openxmlformats.org/drawingml/2006/picture">
+            <wp:extent cx="2340000" cy="2472281"/>
+            <wp:docPr id="1" name="Picture 1"/>
+            <wp:cNvGraphicFramePr>
+              <a:graphicFrameLocks noChangeAspect="1"/>
+            </wp:cNvGraphicFramePr>
+            <a:graphic>
+              <a:graphicData uri="http://schemas.openxmlformats.org/drawingml/2006/picture">
+                <pic:pic>
+                  <pic:nvPicPr>
+                    <pic:cNvPr id="0" name="balancer_spec.jpg"/>
+                    <pic:cNvPicPr/>
+                  </pic:nvPicPr>
+                  <pic:blipFill>
+                    <a:blip r:embed="rId1"/>
+                    <a:stretch>
+                      <a:fillRect/>
+                    </a:stretch>
+                  </pic:blipFill>
+                  <pic:spPr>
+                    <a:xfrm>
+                      <a:off x="0" y="0"/>
+                      <a:ext cx="2340000" cy="2472281"/>
+                    </a:xfrm>
+                    <a:prstGeom prst="rect"/>
+                  </pic:spPr>
+                </pic:pic>
+              </a:graphicData>
+            </a:graphic>
+          </wp:inline>
+        </w:drawing>
+      </w:r>
+    </w:p>
+    <w:p>
+      <w:pPr>
+        <w:jc w:val="center"/>
+      </w:pPr>
+      <w:r>
+        <w:rPr>
+          <w:i/>
+          <w:sz w:val="18"/>
+        </w:rPr>
+        <w:t>JK-DZ08-B2A24S: CAN bus balancer, 8 to 24 strings, 2 A balancing current</w:t>
+      </w:r>
+    </w:p>
+    <w:p>
+      <w:pPr>
+        <w:jc w:val="center"/>
+      </w:pPr>
+      <w:r>
+        <w:drawing>
+          <wp:inline xmlns:wp="http://schemas.openxmlformats.org/drawingml/2006/wordprocessingDrawing" xmlns:a="http://schemas.openxmlformats.org/drawingml/2006/main" xmlns:pic="http://schemas.openxmlformats.org/drawingml/2006/picture">
+            <wp:extent cx="2340000" cy="2185868"/>
+            <wp:docPr id="2" name="Picture 2"/>
+            <wp:cNvGraphicFramePr>
+              <a:graphicFrameLocks noChangeAspect="1"/>
+            </wp:cNvGraphicFramePr>
+            <a:graphic>
+              <a:graphicData uri="http://schemas.openxmlformats.org/drawingml/2006/picture">
+                <pic:pic>
+                  <pic:nvPicPr>
+                    <pic:cNvPr id="0" name="balancer_label.jpg"/>
+                    <pic:cNvPicPr/>
+                  </pic:nvPicPr>
+                  <pic:blipFill>
+                    <a:blip r:embed="rId2"/>
+                    <a:stretch>
+                      <a:fillRect/>
+                    </a:stretch>
+                  </pic:blipFill>
+                  <pic:spPr>
+                    <a:xfrm>
+                      <a:off x="0" y="0"/>
+                      <a:ext cx="2340000" cy="2185868"/>
+                    </a:xfrm>
+                    <a:prstGeom prst="rect"/>
+                  </pic:spPr>
+                </pic:pic>
+              </a:graphicData>
+            </a:graphic>
+          </wp:inline>
+        </w:drawing>
+      </w:r>
+    </w:p>
+    <w:p>
+      <w:pPr>
+        <w:jc w:val="center"/>
+      </w:pPr>
+      <w:r>
+        <w:rPr>
+          <w:i/>
+          <w:sz w:val="18"/>
+        </w:rPr>
+        <w:t>The label states the supply range 24 to 70 V, which is why each balancer gets a 24 V converter</w:t>
+      </w:r>
+    </w:p>
+    <w:p>
+      <w:pPr>
+        <w:jc w:val="center"/>
+      </w:pPr>
+      <w:r>
+        <w:drawing>
+          <wp:inline xmlns:wp="http://schemas.openxmlformats.org/drawingml/2006/wordprocessingDrawing" xmlns:a="http://schemas.openxmlformats.org/drawingml/2006/main" xmlns:pic="http://schemas.openxmlformats.org/drawingml/2006/picture">
+            <wp:extent cx="2160000" cy="2336471"/>
+            <wp:docPr id="3" name="Picture 3"/>
+            <wp:cNvGraphicFramePr>
+              <a:graphicFrameLocks noChangeAspect="1"/>
+            </wp:cNvGraphicFramePr>
+            <a:graphic>
+              <a:graphicData uri="http://schemas.openxmlformats.org/drawingml/2006/picture">
+                <pic:pic>
+                  <pic:nvPicPr>
+                    <pic:cNvPr id="0" name="lem_cab500.jpg"/>
+                    <pic:cNvPicPr/>
+                  </pic:nvPicPr>
+                  <pic:blipFill>
+                    <a:blip r:embed="rId3"/>
+                    <a:stretch>
+                      <a:fillRect/>
+                    </a:stretch>
+                  </pic:blipFill>
+                  <pic:spPr>
+                    <a:xfrm>
+                      <a:off x="0" y="0"/>
+                      <a:ext cx="2160000" cy="2336471"/>
+                    </a:xfrm>
+                    <a:prstGeom prst="rect"/>
+                  </pic:spPr>
+                </pic:pic>
+              </a:graphicData>
+            </a:graphic>
+          </wp:inline>
+        </w:drawing>
+      </w:r>
+    </w:p>
+    <w:p>
+      <w:pPr>
+        <w:jc w:val="center"/>
+      </w:pPr>
+      <w:r>
+        <w:rPr>
+          <w:i/>
+          <w:sz w:val="18"/>
+        </w:rPr>
+        <w:t>LEM CAB500-C/SP5 current sensor</w:t>
+      </w:r>
+    </w:p>
+    <w:p>
+      <w:pPr>
+        <w:jc w:val="center"/>
+      </w:pPr>
+      <w:r>
+        <w:drawing>
+          <wp:inline xmlns:wp="http://schemas.openxmlformats.org/drawingml/2006/wordprocessingDrawing" xmlns:a="http://schemas.openxmlformats.org/drawingml/2006/main" xmlns:pic="http://schemas.openxmlformats.org/drawingml/2006/picture">
+            <wp:extent cx="2880000" cy="1965714"/>
+            <wp:docPr id="4" name="Picture 4"/>
+            <wp:cNvGraphicFramePr>
+              <a:graphicFrameLocks noChangeAspect="1"/>
+            </wp:cNvGraphicFramePr>
+            <a:graphic>
+              <a:graphicData uri="http://schemas.openxmlformats.org/drawingml/2006/picture">
+                <pic:pic>
+                  <pic:nvPicPr>
+                    <pic:cNvPr id="0" name="stb_cab500.jpg"/>
+                    <pic:cNvPicPr/>
+                  </pic:nvPicPr>
+                  <pic:blipFill>
+                    <a:blip r:embed="rId4"/>
+                    <a:stretch>
+                      <a:fillRect/>
+                    </a:stretch>
+                  </pic:blipFill>
+                  <pic:spPr>
+                    <a:xfrm>
+                      <a:off x="0" y="0"/>
+                      <a:ext cx="2880000" cy="1965714"/>
+                    </a:xfrm>
+                    <a:prstGeom prst="rect"/>
+                  </pic:spPr>
+                </pic:pic>
+              </a:graphicData>
+            </a:graphic>
+          </wp:inline>
+        </w:drawing>
+      </w:r>
+    </w:p>
+    <w:p>
+      <w:pPr>
+        <w:jc w:val="center"/>
+      </w:pPr>
+      <w:r>
+        <w:rPr>
+          <w:i/>
+          <w:sz w:val="18"/>
+        </w:rPr>
+        <w:t>STB-CAB500M-22C current sensor, same CAN protocol and socket</w:t>
+      </w:r>
+    </w:p>
+    <w:p>
+      <w:pPr>
+        <w:jc w:val="center"/>
+      </w:pPr>
+      <w:r>
+        <w:drawing>
+          <wp:inline xmlns:wp="http://schemas.openxmlformats.org/drawingml/2006/wordprocessingDrawing" xmlns:a="http://schemas.openxmlformats.org/drawingml/2006/main" xmlns:pic="http://schemas.openxmlformats.org/drawingml/2006/picture">
+            <wp:extent cx="1800000" cy="2167539"/>
+            <wp:docPr id="5" name="Picture 5"/>
+            <wp:cNvGraphicFramePr>
+              <a:graphicFrameLocks noChangeAspect="1"/>
+            </wp:cNvGraphicFramePr>
+            <a:graphic>
+              <a:graphicData uri="http://schemas.openxmlformats.org/drawingml/2006/picture">
+                <pic:pic>
+                  <pic:nvPicPr>
+                    <pic:cNvPr id="0" name="dcdc.jpg"/>
+                    <pic:cNvPicPr/>
+                  </pic:nvPicPr>
+                  <pic:blipFill>
+                    <a:blip r:embed="rId5"/>
+                    <a:stretch>
+                      <a:fillRect/>
+                    </a:stretch>
+                  </pic:blipFill>
+                  <pic:spPr>
+                    <a:xfrm>
+                      <a:off x="0" y="0"/>
+                      <a:ext cx="1800000" cy="2167539"/>
+                    </a:xfrm>
+                    <a:prstGeom prst="rect"/>
+                  </pic:spPr>
+                </pic:pic>
+              </a:graphicData>
+            </a:graphic>
+          </wp:inline>
+        </w:drawing>
+      </w:r>
+    </w:p>
+    <w:p>
+      <w:pPr>
+        <w:jc w:val="center"/>
+      </w:pPr>
+      <w:r>
+        <w:rPr>
+          <w:i/>
+          <w:sz w:val="18"/>
+        </w:rPr>
+        <w:t>Isolated 12 V to 24 V DC-DC module, one per balancer</w:t>
+      </w:r>
+    </w:p>
+    <w:p>
+      <w:pPr>
+        <w:pStyle w:val="Note"/>
+      </w:pPr>
+      <w:r>
+        <w:t>The driver does not care which of the two sensors is fitted, only which CAN ID it transmits on. Set the CAB500 variant dropdown (chapter 7.6) so that the More battery info page shows the sensor as Connected; if it stays Disconnected at the right speed, try the other variants.</w:t>
+      </w:r>
+    </w:p>
+    <w:p>
+      <w:pPr>
+        <w:pStyle w:val="Heading2"/>
+      </w:pPr>
+      <w:r>
+        <w:t>5.2 Balancer cell wiring</w:t>
       </w:r>
     </w:p>
     <w:p>
@@ -1546,7 +2285,7 @@
         </w:numPr>
       </w:pPr>
       <w:r>
-        <w:t>Both CAN buses need 120 ohm termination at each end.</w:t>
+        <w:t>Each balancer measures and balances one group of up to 24 cells through its tap wires B1 to B24; GND is the negative of the first cell of its group. Wire the taps exactly as the JIKONG manual shows and double-check every tap before plugging the connector in: a swapped or missing tap is what the cell count mismatch alarm reports.</w:t>
       </w:r>
     </w:p>
     <w:p>
@@ -1558,7 +2297,7 @@
         </w:numPr>
       </w:pPr>
       <w:r>
-        <w:t>JK balancers: connect CAN-H/CAN-L of every balancer in a chain to the battery CAN port. Each balancer must have a unique address 1..N set in the JK app; the emulator polls address 1 first and expects the others to follow in order.</w:t>
+        <w:t>Series pack with more than 24 cells (bridge mode): the balancers are chained, and the top cell of one group is shared as the first tap of the next balancer, as in the drawing below. In the firmware tick Bridge mode; each balancer after the first then uses cells per balancer minus 1.</w:t>
       </w:r>
     </w:p>
     <w:p>
@@ -1570,7 +2309,7 @@
         </w:numPr>
       </w:pPr>
       <w:r>
-        <w:t>CAB500 current sensor: same bus as the balancers. It sends its variant's ID (0x3C2 for the -2, selectable on the Settings page), 11-bit, 8 bytes, every 10 ms; the current is in bytes 0-3 as milliamps with an offset of 0x80000000, byte 4 holds the error flags. Readings beyond plus or minus 600 A are discarded as power-up artefacts.</w:t>
+        <w:t>Parallel packs (low-voltage mode): each balancer owns one complete pack and the packs are in parallel. Tick Low-voltage mode; the cell count must be a multiple of cells per balancer.</w:t>
       </w:r>
     </w:p>
     <w:p>
@@ -1582,7 +2321,66 @@
         </w:numPr>
       </w:pPr>
       <w:r>
-        <w:t>Inverter: the other CAN port. The inverter protocol sets its speed, 500 kbps for BYD HVS.</w:t>
+        <w:t>Set the balancer's own cell count in the JIKONG app to the number of cells it is wired to (the status page shows identified / set). Give every balancer a unique CAN address 1..N in the app, in the order the groups are wired; the emulator polls address 1 first.</w:t>
+      </w:r>
+    </w:p>
+    <w:p>
+      <w:pPr>
+        <w:jc w:val="center"/>
+      </w:pPr>
+      <w:r>
+        <w:drawing>
+          <wp:inline xmlns:wp="http://schemas.openxmlformats.org/drawingml/2006/wordprocessingDrawing" xmlns:a="http://schemas.openxmlformats.org/drawingml/2006/main" xmlns:pic="http://schemas.openxmlformats.org/drawingml/2006/picture">
+            <wp:extent cx="4320000" cy="2805773"/>
+            <wp:docPr id="6" name="Picture 6"/>
+            <wp:cNvGraphicFramePr>
+              <a:graphicFrameLocks noChangeAspect="1"/>
+            </wp:cNvGraphicFramePr>
+            <a:graphic>
+              <a:graphicData uri="http://schemas.openxmlformats.org/drawingml/2006/picture">
+                <pic:pic>
+                  <pic:nvPicPr>
+                    <pic:cNvPr id="0" name="balancer_bridge.jpg"/>
+                    <pic:cNvPicPr/>
+                  </pic:nvPicPr>
+                  <pic:blipFill>
+                    <a:blip r:embed="rId6"/>
+                    <a:stretch>
+                      <a:fillRect/>
+                    </a:stretch>
+                  </pic:blipFill>
+                  <pic:spPr>
+                    <a:xfrm>
+                      <a:off x="0" y="0"/>
+                      <a:ext cx="4320000" cy="2805773"/>
+                    </a:xfrm>
+                    <a:prstGeom prst="rect"/>
+                  </pic:spPr>
+                </pic:pic>
+              </a:graphicData>
+            </a:graphic>
+          </wp:inline>
+        </w:drawing>
+      </w:r>
+    </w:p>
+    <w:p>
+      <w:pPr>
+        <w:jc w:val="center"/>
+      </w:pPr>
+      <w:r>
+        <w:rPr>
+          <w:i/>
+          <w:sz w:val="18"/>
+        </w:rPr>
+        <w:t>Bridge wiring from the JIKONG manual: balancer 1's top cell B24 is also balancer 2's first tap</w:t>
+      </w:r>
+    </w:p>
+    <w:p>
+      <w:pPr>
+        <w:pStyle w:val="Heading2"/>
+      </w:pPr>
+      <w:r>
+        <w:t>5.3 Balancer power</w:t>
       </w:r>
     </w:p>
     <w:p>
@@ -1594,7 +2392,31 @@
         </w:numPr>
       </w:pPr>
       <w:r>
-        <w:t>Power sequence: balancers first, or together with the emulator. The balancers take about 5 s to boot; the driver gives them 10 s and suppresses CAN bus error warnings on the battery port for that time.</w:t>
+        <w:t>The balancer needs 24 to 70 V on PWR. Instead of taking it from the cells, each balancer has its own isolated DC-DC converter: 12 V in from the installation's 12 V supply, 24 V out.</w:t>
+      </w:r>
+    </w:p>
+    <w:p>
+      <w:pPr>
+        <w:pStyle w:val="ListParagraph"/>
+        <w:numPr>
+          <w:ilvl w:val="0"/>
+          <w:numId w:val="1"/>
+        </w:numPr>
+      </w:pPr>
+      <w:r>
+        <w:t>Converter output plus to the balancer PWR terminal, converter output minus to the balancer GND terminal. Because the converter is isolated, its output rides on the potential of that balancer's cell group; never share one converter between two balancers whose groups are in series.</w:t>
+      </w:r>
+    </w:p>
+    <w:p>
+      <w:pPr>
+        <w:pStyle w:val="ListParagraph"/>
+        <w:numPr>
+          <w:ilvl w:val="0"/>
+          <w:numId w:val="1"/>
+        </w:numPr>
+      </w:pPr>
+      <w:r>
+        <w:t>Converter input: 12 V and ground from the same 12 V supply as the emulator. The inputs of all converters can be in parallel.</w:t>
       </w:r>
     </w:p>
     <w:p>
@@ -1602,7 +2424,550 @@
         <w:pStyle w:val="Note"/>
       </w:pPr>
       <w:r>
-        <w:t>There is no analog current sensor input and no CAN speed setting any more. The battery port is fixed at 250 kbps by the driver; a CAB500 at factory 500 kbps is reconfigured from the web page (chapter 11).</w:t>
+        <w:t>Check the PWR and GND terminal names against your balancer's manual before powering up; the label and connector layout differ between hardware revisions.</w:t>
+      </w:r>
+    </w:p>
+    <w:p>
+      <w:pPr>
+        <w:pStyle w:val="Heading2"/>
+      </w:pPr>
+      <w:r>
+        <w:t>5.4 CAB500 current sensor</w:t>
+      </w:r>
+    </w:p>
+    <w:p>
+      <w:pPr>
+        <w:jc w:val="center"/>
+      </w:pPr>
+      <w:r>
+        <w:drawing>
+          <wp:inline xmlns:wp="http://schemas.openxmlformats.org/drawingml/2006/wordprocessingDrawing" xmlns:a="http://schemas.openxmlformats.org/drawingml/2006/main" xmlns:pic="http://schemas.openxmlformats.org/drawingml/2006/picture">
+            <wp:extent cx="2160000" cy="1545366"/>
+            <wp:docPr id="7" name="Picture 7"/>
+            <wp:cNvGraphicFramePr>
+              <a:graphicFrameLocks noChangeAspect="1"/>
+            </wp:cNvGraphicFramePr>
+            <a:graphic>
+              <a:graphicData uri="http://schemas.openxmlformats.org/drawingml/2006/picture">
+                <pic:pic>
+                  <pic:nvPicPr>
+                    <pic:cNvPr id="0" name="cab500_terminals.jpg"/>
+                    <pic:cNvPicPr/>
+                  </pic:nvPicPr>
+                  <pic:blipFill>
+                    <a:blip r:embed="rId7"/>
+                    <a:stretch>
+                      <a:fillRect/>
+                    </a:stretch>
+                  </pic:blipFill>
+                  <pic:spPr>
+                    <a:xfrm>
+                      <a:off x="0" y="0"/>
+                      <a:ext cx="2160000" cy="1545366"/>
+                    </a:xfrm>
+                    <a:prstGeom prst="rect"/>
+                  </pic:spPr>
+                </pic:pic>
+              </a:graphicData>
+            </a:graphic>
+          </wp:inline>
+        </w:drawing>
+      </w:r>
+    </w:p>
+    <w:p>
+      <w:pPr>
+        <w:jc w:val="center"/>
+      </w:pPr>
+      <w:r>
+        <w:rPr>
+          <w:i/>
+          <w:sz w:val="18"/>
+        </w:rPr>
+        <w:t>CAB500 socket: 1 CAN-L, 2 CAN-H, 3 GND, 4 Uc</w:t>
+      </w:r>
+    </w:p>
+    <w:p>
+      <w:pPr>
+        <w:jc w:val="center"/>
+      </w:pPr>
+      <w:r>
+        <w:drawing>
+          <wp:inline xmlns:wp="http://schemas.openxmlformats.org/drawingml/2006/wordprocessingDrawing" xmlns:a="http://schemas.openxmlformats.org/drawingml/2006/main" xmlns:pic="http://schemas.openxmlformats.org/drawingml/2006/picture">
+            <wp:extent cx="1800000" cy="1783486"/>
+            <wp:docPr id="8" name="Picture 8"/>
+            <wp:cNvGraphicFramePr>
+              <a:graphicFrameLocks noChangeAspect="1"/>
+            </wp:cNvGraphicFramePr>
+            <a:graphic>
+              <a:graphicData uri="http://schemas.openxmlformats.org/drawingml/2006/picture">
+                <pic:pic>
+                  <pic:nvPicPr>
+                    <pic:cNvPr id="0" name="cab500_connector.jpg"/>
+                    <pic:cNvPicPr/>
+                  </pic:nvPicPr>
+                  <pic:blipFill>
+                    <a:blip r:embed="rId8"/>
+                    <a:stretch>
+                      <a:fillRect/>
+                    </a:stretch>
+                  </pic:blipFill>
+                  <pic:spPr>
+                    <a:xfrm>
+                      <a:off x="0" y="0"/>
+                      <a:ext cx="1800000" cy="1783486"/>
+                    </a:xfrm>
+                    <a:prstGeom prst="rect"/>
+                  </pic:spPr>
+                </pic:pic>
+              </a:graphicData>
+            </a:graphic>
+          </wp:inline>
+        </w:drawing>
+      </w:r>
+    </w:p>
+    <w:p>
+      <w:pPr>
+        <w:jc w:val="center"/>
+      </w:pPr>
+      <w:r>
+        <w:rPr>
+          <w:i/>
+          <w:sz w:val="18"/>
+        </w:rPr>
+        <w:t>Mating 4-pin harness (TE 1612035-1 family)</w:t>
+      </w:r>
+    </w:p>
+    <w:tbl>
+      <w:tblPr>
+        <w:tblStyle w:val="TableGrid"/>
+        <w:tblW w:type="auto" w:w="0"/>
+        <w:tblLayout w:type="fixed"/>
+        <w:tblLook w:firstColumn="1" w:firstRow="1" w:lastColumn="0" w:lastRow="0" w:noHBand="0" w:noVBand="1" w:val="04A0"/>
+        <w:tblLayout w:type="fixed"/>
+      </w:tblPr>
+      <w:tblGrid>
+        <w:gridCol w:w="900"/>
+        <w:gridCol w:w="1600"/>
+        <w:gridCol w:w="6526"/>
+      </w:tblGrid>
+      <w:tr>
+        <w:trPr>
+          <w:tblHeader/>
+        </w:trPr>
+        <w:tc>
+          <w:tcPr>
+            <w:tcW w:type="dxa" w:w="900"/>
+            <w:shd w:val="clear" w:color="auto" w:fill="1F3864"/>
+          </w:tcPr>
+          <w:p>
+            <w:pPr>
+              <w:spacing w:before="40" w:after="40"/>
+            </w:pPr>
+            <w:r>
+              <w:rPr>
+                <w:b/>
+                <w:color w:val="FFFFFF"/>
+                <w:sz w:val="19"/>
+              </w:rPr>
+              <w:t>Pin</w:t>
+            </w:r>
+          </w:p>
+        </w:tc>
+        <w:tc>
+          <w:tcPr>
+            <w:tcW w:type="dxa" w:w="1600"/>
+            <w:shd w:val="clear" w:color="auto" w:fill="1F3864"/>
+          </w:tcPr>
+          <w:p>
+            <w:pPr>
+              <w:spacing w:before="40" w:after="40"/>
+            </w:pPr>
+            <w:r>
+              <w:rPr>
+                <w:b/>
+                <w:color w:val="FFFFFF"/>
+                <w:sz w:val="19"/>
+              </w:rPr>
+              <w:t>Signal</w:t>
+            </w:r>
+          </w:p>
+        </w:tc>
+        <w:tc>
+          <w:tcPr>
+            <w:tcW w:type="dxa" w:w="6526"/>
+            <w:shd w:val="clear" w:color="auto" w:fill="1F3864"/>
+          </w:tcPr>
+          <w:p>
+            <w:pPr>
+              <w:spacing w:before="40" w:after="40"/>
+            </w:pPr>
+            <w:r>
+              <w:rPr>
+                <w:b/>
+                <w:color w:val="FFFFFF"/>
+                <w:sz w:val="19"/>
+              </w:rPr>
+              <w:t>Wire to</w:t>
+            </w:r>
+          </w:p>
+        </w:tc>
+      </w:tr>
+      <w:tr>
+        <w:tc>
+          <w:tcPr>
+            <w:tcW w:type="dxa" w:w="900"/>
+          </w:tcPr>
+          <w:p>
+            <w:pPr>
+              <w:spacing w:before="20" w:after="20"/>
+            </w:pPr>
+            <w:r>
+              <w:rPr>
+                <w:sz w:val="19"/>
+              </w:rPr>
+              <w:t>1</w:t>
+            </w:r>
+          </w:p>
+        </w:tc>
+        <w:tc>
+          <w:tcPr>
+            <w:tcW w:type="dxa" w:w="1600"/>
+          </w:tcPr>
+          <w:p>
+            <w:pPr>
+              <w:spacing w:before="20" w:after="20"/>
+            </w:pPr>
+            <w:r>
+              <w:rPr>
+                <w:sz w:val="19"/>
+              </w:rPr>
+              <w:t>CAN-L</w:t>
+            </w:r>
+          </w:p>
+        </w:tc>
+        <w:tc>
+          <w:tcPr>
+            <w:tcW w:type="dxa" w:w="6526"/>
+          </w:tcPr>
+          <w:p>
+            <w:pPr>
+              <w:spacing w:before="20" w:after="20"/>
+            </w:pPr>
+            <w:r>
+              <w:rPr>
+                <w:sz w:val="19"/>
+              </w:rPr>
+              <w:t>Battery CAN bus CAN-L (same bus as the balancers)</w:t>
+            </w:r>
+          </w:p>
+        </w:tc>
+      </w:tr>
+      <w:tr>
+        <w:tc>
+          <w:tcPr>
+            <w:tcW w:type="dxa" w:w="900"/>
+          </w:tcPr>
+          <w:p>
+            <w:pPr>
+              <w:spacing w:before="20" w:after="20"/>
+            </w:pPr>
+            <w:r>
+              <w:rPr>
+                <w:sz w:val="19"/>
+              </w:rPr>
+              <w:t>2</w:t>
+            </w:r>
+          </w:p>
+        </w:tc>
+        <w:tc>
+          <w:tcPr>
+            <w:tcW w:type="dxa" w:w="1600"/>
+          </w:tcPr>
+          <w:p>
+            <w:pPr>
+              <w:spacing w:before="20" w:after="20"/>
+            </w:pPr>
+            <w:r>
+              <w:rPr>
+                <w:sz w:val="19"/>
+              </w:rPr>
+              <w:t>CAN-H</w:t>
+            </w:r>
+          </w:p>
+        </w:tc>
+        <w:tc>
+          <w:tcPr>
+            <w:tcW w:type="dxa" w:w="6526"/>
+          </w:tcPr>
+          <w:p>
+            <w:pPr>
+              <w:spacing w:before="20" w:after="20"/>
+            </w:pPr>
+            <w:r>
+              <w:rPr>
+                <w:sz w:val="19"/>
+              </w:rPr>
+              <w:t>Battery CAN bus CAN-H</w:t>
+            </w:r>
+          </w:p>
+        </w:tc>
+      </w:tr>
+      <w:tr>
+        <w:tc>
+          <w:tcPr>
+            <w:tcW w:type="dxa" w:w="900"/>
+          </w:tcPr>
+          <w:p>
+            <w:pPr>
+              <w:spacing w:before="20" w:after="20"/>
+            </w:pPr>
+            <w:r>
+              <w:rPr>
+                <w:sz w:val="19"/>
+              </w:rPr>
+              <w:t>3</w:t>
+            </w:r>
+          </w:p>
+        </w:tc>
+        <w:tc>
+          <w:tcPr>
+            <w:tcW w:type="dxa" w:w="1600"/>
+          </w:tcPr>
+          <w:p>
+            <w:pPr>
+              <w:spacing w:before="20" w:after="20"/>
+            </w:pPr>
+            <w:r>
+              <w:rPr>
+                <w:sz w:val="19"/>
+              </w:rPr>
+              <w:t>GND</w:t>
+            </w:r>
+          </w:p>
+        </w:tc>
+        <w:tc>
+          <w:tcPr>
+            <w:tcW w:type="dxa" w:w="6526"/>
+          </w:tcPr>
+          <w:p>
+            <w:pPr>
+              <w:spacing w:before="20" w:after="20"/>
+            </w:pPr>
+            <w:r>
+              <w:rPr>
+                <w:sz w:val="19"/>
+              </w:rPr>
+              <w:t>Ground of the 12 V supply (common with the emulator and the CAN bus ground)</w:t>
+            </w:r>
+          </w:p>
+        </w:tc>
+      </w:tr>
+      <w:tr>
+        <w:tc>
+          <w:tcPr>
+            <w:tcW w:type="dxa" w:w="900"/>
+          </w:tcPr>
+          <w:p>
+            <w:pPr>
+              <w:spacing w:before="20" w:after="20"/>
+            </w:pPr>
+            <w:r>
+              <w:rPr>
+                <w:sz w:val="19"/>
+              </w:rPr>
+              <w:t>4</w:t>
+            </w:r>
+          </w:p>
+        </w:tc>
+        <w:tc>
+          <w:tcPr>
+            <w:tcW w:type="dxa" w:w="1600"/>
+          </w:tcPr>
+          <w:p>
+            <w:pPr>
+              <w:spacing w:before="20" w:after="20"/>
+            </w:pPr>
+            <w:r>
+              <w:rPr>
+                <w:sz w:val="19"/>
+              </w:rPr>
+              <w:t>Uc</w:t>
+            </w:r>
+          </w:p>
+        </w:tc>
+        <w:tc>
+          <w:tcPr>
+            <w:tcW w:type="dxa" w:w="6526"/>
+          </w:tcPr>
+          <w:p>
+            <w:pPr>
+              <w:spacing w:before="20" w:after="20"/>
+            </w:pPr>
+            <w:r>
+              <w:rPr>
+                <w:sz w:val="19"/>
+              </w:rPr>
+              <w:t>12 V from the emulator's supply. The sensor accepts 8 to 16 V; never the 24 V of the converters.</w:t>
+            </w:r>
+          </w:p>
+        </w:tc>
+      </w:tr>
+    </w:tbl>
+    <w:p/>
+    <w:p>
+      <w:pPr>
+        <w:pStyle w:val="ListParagraph"/>
+        <w:numPr>
+          <w:ilvl w:val="0"/>
+          <w:numId w:val="1"/>
+        </w:numPr>
+      </w:pPr>
+      <w:r>
+        <w:t>Clamp the sensor around one pack cable, positive or negative, between the pack and the contactors, so that every amp in or out of the pack passes through it. Only one cable through the ring.</w:t>
+      </w:r>
+    </w:p>
+    <w:p>
+      <w:pPr>
+        <w:pStyle w:val="ListParagraph"/>
+        <w:numPr>
+          <w:ilvl w:val="0"/>
+          <w:numId w:val="1"/>
+        </w:numPr>
+      </w:pPr>
+      <w:r>
+        <w:t>The sign must be positive while charging. If the main page shows negative current while charging, tick Reverse current sensor direction in the JK settings and reboot; no need to turn the sensor around.</w:t>
+      </w:r>
+    </w:p>
+    <w:p>
+      <w:pPr>
+        <w:pStyle w:val="ListParagraph"/>
+        <w:numPr>
+          <w:ilvl w:val="0"/>
+          <w:numId w:val="1"/>
+        </w:numPr>
+      </w:pPr>
+      <w:r>
+        <w:t>A new sensor transmits at 500 kbps and will show Disconnected with a comms fault after about 40 s. Change it to 250 kbps once from the More battery info page (chapter 11), then reboot.</w:t>
+      </w:r>
+    </w:p>
+    <w:p>
+      <w:pPr>
+        <w:pStyle w:val="ListParagraph"/>
+        <w:numPr>
+          <w:ilvl w:val="0"/>
+          <w:numId w:val="1"/>
+        </w:numPr>
+      </w:pPr>
+      <w:r>
+        <w:t>Readings beyond plus or minus 600 A are ignored as power-up artefacts; the sensor itself flags overcurrent at about 520 A.</w:t>
+      </w:r>
+    </w:p>
+    <w:p>
+      <w:pPr>
+        <w:pStyle w:val="Heading2"/>
+      </w:pPr>
+      <w:r>
+        <w:t>5.5 CAN wiring</w:t>
+      </w:r>
+    </w:p>
+    <w:p>
+      <w:pPr>
+        <w:pStyle w:val="ListParagraph"/>
+        <w:numPr>
+          <w:ilvl w:val="0"/>
+          <w:numId w:val="1"/>
+        </w:numPr>
+      </w:pPr>
+      <w:r>
+        <w:t>The T-2CAN has two CAN ports with transceivers on board, CAN 1 (native) and CAN 2 (MCP2515). Which one is the battery port and which the inverter port is chosen on the Settings page (Battery CAN interface, Inverter CAN interface); both assignments work. The driver runs the battery port at 250 kbps, the inverter protocol sets the other.</w:t>
+      </w:r>
+    </w:p>
+    <w:p>
+      <w:pPr>
+        <w:pStyle w:val="ListParagraph"/>
+        <w:numPr>
+          <w:ilvl w:val="0"/>
+          <w:numId w:val="1"/>
+        </w:numPr>
+      </w:pPr>
+      <w:r>
+        <w:t>Battery bus: one twisted pair CAN-H / CAN-L from the emulator's battery port along the balancers to the last balancer, with the CAB500 tapped in along the way. Run the CAN ground with it. Do not star-wire.</w:t>
+      </w:r>
+    </w:p>
+    <w:p>
+      <w:pPr>
+        <w:pStyle w:val="ListParagraph"/>
+        <w:numPr>
+          <w:ilvl w:val="0"/>
+          <w:numId w:val="1"/>
+        </w:numPr>
+      </w:pPr>
+      <w:r>
+        <w:t>Termination: 120 ohm at the emulator end (the T-2CAN termination for that port) and 120 ohm at the last balancer. The CAB500 sits mid-bus without a resistor. The balancer's CAN connector pin order is on the balancer's label or manual.</w:t>
+      </w:r>
+    </w:p>
+    <w:p>
+      <w:pPr>
+        <w:pStyle w:val="ListParagraph"/>
+        <w:numPr>
+          <w:ilvl w:val="0"/>
+          <w:numId w:val="1"/>
+        </w:numPr>
+      </w:pPr>
+      <w:r>
+        <w:t>Inverter bus: the other port to the inverter, terminated at both ends as that protocol requires.</w:t>
+      </w:r>
+    </w:p>
+    <w:p>
+      <w:pPr>
+        <w:pStyle w:val="ListParagraph"/>
+        <w:numPr>
+          <w:ilvl w:val="0"/>
+          <w:numId w:val="1"/>
+        </w:numPr>
+      </w:pPr>
+      <w:r>
+        <w:t>Second battery: its balancers and its own CAB500 need a CAN port of their own, so with a CAN inverter the T-2CAN's two ports are used up by one pack and the inverter; a second JK pack needs an RS485/Modbus inverter or a board with a third CAN interface. Two sensors cannot share a bus unless they are different variants.</w:t>
+      </w:r>
+    </w:p>
+    <w:p>
+      <w:pPr>
+        <w:pStyle w:val="Heading2"/>
+      </w:pPr>
+      <w:r>
+        <w:t>5.6 Power-up order</w:t>
+      </w:r>
+    </w:p>
+    <w:p>
+      <w:pPr>
+        <w:pStyle w:val="ListParagraph"/>
+        <w:numPr>
+          <w:ilvl w:val="0"/>
+          <w:numId w:val="1"/>
+        </w:numPr>
+      </w:pPr>
+      <w:r>
+        <w:t>Power the balancers (converters) before or together with the emulator. The balancers take about 5 s to boot; the driver polls balancer 1 for 10 s and suppresses CAN bus error warnings on the battery port meanwhile. If no balancer answered within 10 s the driver stops polling until the next reboot.</w:t>
+      </w:r>
+    </w:p>
+    <w:p>
+      <w:pPr>
+        <w:pStyle w:val="ListParagraph"/>
+        <w:numPr>
+          <w:ilvl w:val="0"/>
+          <w:numId w:val="1"/>
+        </w:numPr>
+      </w:pPr>
+      <w:r>
+        <w:t>The CAB500 has a 30 s grace period after boot before its fault counting starts, so it may be powered with the emulator.</w:t>
+      </w:r>
+    </w:p>
+    <w:p>
+      <w:pPr>
+        <w:pStyle w:val="Note"/>
+      </w:pPr>
+      <w:r>
+        <w:t>There is no analog current sensor input and no CAN speed setting. The battery port is fixed at 250 kbps by the driver.</w:t>
       </w:r>
     </w:p>
     <w:p>
@@ -2882,7 +4247,7 @@
               <w:rPr>
                 <w:sz w:val="19"/>
               </w:rPr>
-              <w:t>SOC where discharge power reaches zero. New in this firmware; 8.13 had a fixed 7 %.</w:t>
+              <w:t>SOC where discharge power reaches zero.</w:t>
             </w:r>
           </w:p>
         </w:tc>
@@ -3014,7 +4379,7 @@
               <w:rPr>
                 <w:sz w:val="19"/>
               </w:rPr>
-              <w:t>Below Target discharge voltage (main page) discharge is 0 W; it resumes once the pack is this far above the target. 3.0 V suits a 96S pack; use about 0.1 V for a few cells. New in this firmware.</w:t>
+              <w:t>Below Target discharge voltage (main page) discharge is 0 W; it resumes once the pack is this far above the target. 3.0 V suits a 96S pack; use about 0.1 V for a few cells.</w:t>
             </w:r>
           </w:p>
         </w:tc>
@@ -4969,7 +6334,7 @@
         </w:numPr>
       </w:pPr>
       <w:r>
-        <w:t>While the CAB500 sends nothing (unplugged, boot grace), the counter sees 0 A and the SOC freezes. 8.13 kept integrating the last reading.</w:t>
+        <w:t>While the CAB500 sends nothing (unplugged, boot grace), the counter sees 0 A and the SOC freezes.</w:t>
       </w:r>
     </w:p>
     <w:p>
@@ -5902,7 +7267,7 @@
         </w:numPr>
       </w:pPr>
       <w:r>
-        <w:t>2. Pack voltage below Target discharge voltage: discharge 0 W, charge from the charge ramp. An empty pack can always be recharged (8.13 froze the charge limit here).</w:t>
+        <w:t>2. Pack voltage below Target discharge voltage: discharge 0 W, charge from the charge ramp. An empty pack can always be recharged.</w:t>
       </w:r>
     </w:p>
     <w:p>
@@ -8548,146 +9913,6 @@
     <w:p>
       <w:r>
         <w:t>For a second JK pack the same events carry a _BAT2 suffix and the Events page names the pack.</w:t>
-      </w:r>
-    </w:p>
-    <w:p>
-      <w:pPr>
-        <w:pStyle w:val="Heading1"/>
-      </w:pPr>
-      <w:r>
-        <w:t>Appendix D. Differences to the 8.13 firmware</w:t>
-      </w:r>
-    </w:p>
-    <w:p>
-      <w:pPr>
-        <w:pStyle w:val="ListParagraph"/>
-        <w:numPr>
-          <w:ilvl w:val="0"/>
-          <w:numId w:val="1"/>
-        </w:numPr>
-      </w:pPr>
-      <w:r>
-        <w:t>All compile-time settings, the custom pins and the CAN speed settings are gone. Battery type, interfaces and every JK value are on the Settings page; the LilyGo T-2CAN is the target board with its standard v13 pins.</w:t>
-      </w:r>
-    </w:p>
-    <w:p>
-      <w:pPr>
-        <w:pStyle w:val="ListParagraph"/>
-        <w:numPr>
-          <w:ilvl w:val="0"/>
-          <w:numId w:val="1"/>
-        </w:numPr>
-      </w:pPr>
-      <w:r>
-        <w:t>Analog current sensor removed. CAB500 only, with a web-page CAN speed reconfiguration.</w:t>
-      </w:r>
-    </w:p>
-    <w:p>
-      <w:pPr>
-        <w:pStyle w:val="ListParagraph"/>
-        <w:numPr>
-          <w:ilvl w:val="0"/>
-          <w:numId w:val="1"/>
-        </w:numPr>
-      </w:pPr>
-      <w:r>
-        <w:t>New settings: Discharge ramp bottom (was fixed 7 %) and Discharge cut-off hysteresis (was fixed 3.0 V).</w:t>
-      </w:r>
-    </w:p>
-    <w:p>
-      <w:pPr>
-        <w:pStyle w:val="ListParagraph"/>
-        <w:numPr>
-          <w:ilvl w:val="0"/>
-          <w:numId w:val="1"/>
-        </w:numPr>
-      </w:pPr>
-      <w:r>
-        <w:t>Defaults changed to 96 cells, 24 per balancer, series mode, firmware version 2, cell max 4220 mV.</w:t>
-      </w:r>
-    </w:p>
-    <w:p>
-      <w:pPr>
-        <w:pStyle w:val="ListParagraph"/>
-        <w:numPr>
-          <w:ilvl w:val="0"/>
-          <w:numId w:val="1"/>
-        </w:numPr>
-      </w:pPr>
-      <w:r>
-        <w:t>Charging is allowed below the discharge cut-off (8.13 froze the charge limit at 0 W after a boot below it).</w:t>
-      </w:r>
-    </w:p>
-    <w:p>
-      <w:pPr>
-        <w:pStyle w:val="ListParagraph"/>
-        <w:numPr>
-          <w:ilvl w:val="0"/>
-          <w:numId w:val="1"/>
-        </w:numPr>
-      </w:pPr>
-      <w:r>
-        <w:t>Full / empty flags work (8.13 never set them); the full and empty events themselves belong to v13.</w:t>
-      </w:r>
-    </w:p>
-    <w:p>
-      <w:pPr>
-        <w:pStyle w:val="ListParagraph"/>
-        <w:numPr>
-          <w:ilvl w:val="0"/>
-          <w:numId w:val="1"/>
-        </w:numPr>
-      </w:pPr>
-      <w:r>
-        <w:t>Start-up: nothing is published until every cell has reported, 50 % placeholder SOC, no stop request while waiting, CAN error warnings suppressed for 10 s, balancer 1 polled for 10 s instead of 5 s.</w:t>
-      </w:r>
-    </w:p>
-    <w:p>
-      <w:pPr>
-        <w:pStyle w:val="ListParagraph"/>
-        <w:numPr>
-          <w:ilvl w:val="0"/>
-          <w:numId w:val="1"/>
-        </w:numPr>
-      </w:pPr>
-      <w:r>
-        <w:t>All faults latch until reboot (8.13 recovered communication faults automatically). Alarm bits are debounced over 3 frames. Specific JK events replace the generic charge/discharge stop request, plus warnings before the 10 s fault.</w:t>
-      </w:r>
-    </w:p>
-    <w:p>
-      <w:pPr>
-        <w:pStyle w:val="ListParagraph"/>
-        <w:numPr>
-          <w:ilvl w:val="0"/>
-          <w:numId w:val="1"/>
-        </w:numPr>
-      </w:pPr>
-      <w:r>
-        <w:t>CAB500 outage: 0 A to the counter instead of the stale reading; readings beyond plus or minus 600 A discarded.</w:t>
-      </w:r>
-    </w:p>
-    <w:p>
-      <w:pPr>
-        <w:pStyle w:val="ListParagraph"/>
-        <w:numPr>
-          <w:ilvl w:val="0"/>
-          <w:numId w:val="1"/>
-        </w:numPr>
-      </w:pPr>
-      <w:r>
-        <w:t>Cell deviation: linear derate between the setting and setting + 50 mV instead of a jump to 50 W, with its own warning event.</w:t>
-      </w:r>
-    </w:p>
-    <w:p>
-      <w:pPr>
-        <w:pStyle w:val="ListParagraph"/>
-        <w:numPr>
-          <w:ilvl w:val="0"/>
-          <w:numId w:val="1"/>
-        </w:numPr>
-      </w:pPr>
-      <w:r>
-        <w:t>SOC plausibility warning is no longer cleared by the driver (v13 behaviour).</w:t>
       </w:r>
     </w:p>
     <w:sectPr>

</xml_diff>

<commit_message>
docs: balancer supply range 20 to 100 V
</commit_message>
<xml_diff>
--- a/JK-Active-Balancer-Manual-v13.docx
+++ b/JK-Active-Balancer-Manual-v13.docx
@@ -1682,7 +1682,7 @@
               <w:rPr>
                 <w:sz w:val="19"/>
               </w:rPr>
-              <w:t>One per group of up to 24 cells. Supply 24 to 70 V (label), balancing 0.1 to 2 A, 3 mV accuracy.</w:t>
+              <w:t>One per group of up to 24 cells. Supply 20 to 100 V, balancing 0.1 to 2 A, 3 mV accuracy.</w:t>
             </w:r>
           </w:p>
         </w:tc>
@@ -2104,7 +2104,7 @@
           <w:i/>
           <w:sz w:val="18"/>
         </w:rPr>
-        <w:t>The label states the supply range 24 to 70 V, which is why each balancer gets a 24 V converter</w:t>
+        <w:t>Balancer label. The supply input accepts 20 to 100 V; each balancer gets a 24 V converter</w:t>
       </w:r>
     </w:p>
     <w:p>
@@ -2392,7 +2392,7 @@
         </w:numPr>
       </w:pPr>
       <w:r>
-        <w:t>The balancer needs 24 to 70 V on PWR. Instead of taking it from the cells, each balancer has its own isolated DC-DC converter: 12 V in from the installation's 12 V supply, 24 V out.</w:t>
+        <w:t>The balancer needs 20 to 100 V on PWR. Instead of taking it from the cells, each balancer has its own isolated DC-DC converter: 12 V in from the installation's 12 V supply, 24 V out.</w:t>
       </w:r>
     </w:p>
     <w:p>

</xml_diff>

<commit_message>
Docs: T-CAN485 2nd battery contactor and equipment stop pins in the manual and help texts
</commit_message>
<xml_diff>
--- a/JK-Active-Balancer-Manual-v13.docx
+++ b/JK-Active-Balancer-Manual-v13.docx
@@ -2972,6 +2972,320 @@
     </w:p>
     <w:p>
       <w:pPr>
+        <w:pStyle w:val="Heading2"/>
+      </w:pPr>
+      <w:r>
+        <w:t>5.7 LilyGo T-CAN485: 2nd battery contactors and equipment stop pins</w:t>
+      </w:r>
+    </w:p>
+    <w:p>
+      <w:pPr>
+        <w:pStyle w:val="ListParagraph"/>
+        <w:numPr>
+          <w:ilvl w:val="0"/>
+          <w:numId w:val="1"/>
+        </w:numPr>
+      </w:pPr>
+      <w:r>
+        <w:t>On the LilyGo T-CAN485 (lilygo_330) the 2nd battery contactor output and the equipment stop input can be moved to another pin under Settings, Hardware config: "2nd battery contactor pin" appears when 2nd battery contactor control via GPIO is ticked, "Equipment stop pin" appears when an equipment stop button type is selected. Save and restart to apply.</w:t>
+      </w:r>
+    </w:p>
+    <w:p>
+      <w:pPr>
+        <w:pStyle w:val="ListParagraph"/>
+        <w:numPr>
+          <w:ilvl w:val="0"/>
+          <w:numId w:val="1"/>
+        </w:numPr>
+      </w:pPr>
+      <w:r>
+        <w:t>2nd battery contactors: Pin 15 (default) or Pin 14. Equipment stop: Pin 35 (default), Pin 15 or Pin 14. Existing installations keep Pin 15 and Pin 35 after the update.</w:t>
+      </w:r>
+    </w:p>
+    <w:p>
+      <w:pPr>
+        <w:pStyle w:val="ListParagraph"/>
+        <w:numPr>
+          <w:ilvl w:val="0"/>
+          <w:numId w:val="1"/>
+        </w:numPr>
+      </w:pPr>
+      <w:r>
+        <w:t>Pin 35 is also the interrupt of the MCP2515 CAN add-on. With the add-on in use, put the equipment stop on Pin 15 or Pin 14. The settings page does not offer a pin that is already taken and refuses to save a clash.</w:t>
+      </w:r>
+    </w:p>
+    <w:p>
+      <w:pPr>
+        <w:pStyle w:val="ListParagraph"/>
+        <w:numPr>
+          <w:ilvl w:val="0"/>
+          <w:numId w:val="1"/>
+        </w:numPr>
+      </w:pPr>
+      <w:r>
+        <w:t>Pins 14 and 15 are also the SD card slot (CLK and CMD). While either of them drives the contactors or reads the stop, SD logging is not started and its settings are hidden.</w:t>
+      </w:r>
+    </w:p>
+    <w:p>
+      <w:pPr>
+        <w:pStyle w:val="ListParagraph"/>
+        <w:numPr>
+          <w:ilvl w:val="0"/>
+          <w:numId w:val="1"/>
+        </w:numPr>
+      </w:pPr>
+      <w:r>
+        <w:t>Equipment stop wiring: as for the other boards, the normally closed switch feeds the pin from 3.3 V through 2 kOhm, and 10 kOhm pulls the pin down to GND. Closed switch = HIGH = run; pressed switch or broken wire = LOW = stop. The firmware does not use an internal pull resistor on any of the three pins.</w:t>
+      </w:r>
+    </w:p>
+    <w:tbl>
+      <w:tblPr>
+        <w:tblStyle w:val="TableGrid"/>
+        <w:tblW w:type="auto" w:w="0"/>
+        <w:tblLayout w:type="fixed"/>
+        <w:tblLook w:firstColumn="1" w:firstRow="1" w:lastColumn="0" w:lastRow="0" w:noHBand="0" w:noVBand="1" w:val="04A0"/>
+        <w:tblLayout w:type="fixed"/>
+      </w:tblPr>
+      <w:tblGrid>
+        <w:gridCol w:w="900"/>
+        <w:gridCol w:w="1600"/>
+        <w:gridCol w:w="6526"/>
+      </w:tblGrid>
+      <w:tr>
+        <w:trPr>
+          <w:tblHeader/>
+        </w:trPr>
+        <w:tc>
+          <w:tcPr>
+            <w:tcW w:type="dxa" w:w="900"/>
+            <w:shd w:val="clear" w:color="auto" w:fill="1F3864"/>
+          </w:tcPr>
+          <w:p>
+            <w:pPr>
+              <w:spacing w:before="40" w:after="40"/>
+            </w:pPr>
+            <w:r>
+              <w:rPr>
+                <w:b/>
+                <w:color w:val="FFFFFF"/>
+                <w:sz w:val="19"/>
+              </w:rPr>
+              <w:t>Pin</w:t>
+            </w:r>
+          </w:p>
+        </w:tc>
+        <w:tc>
+          <w:tcPr>
+            <w:tcW w:type="dxa" w:w="1600"/>
+            <w:shd w:val="clear" w:color="auto" w:fill="1F3864"/>
+          </w:tcPr>
+          <w:p>
+            <w:pPr>
+              <w:spacing w:before="40" w:after="40"/>
+            </w:pPr>
+            <w:r>
+              <w:rPr>
+                <w:b/>
+                <w:color w:val="FFFFFF"/>
+                <w:sz w:val="19"/>
+              </w:rPr>
+              <w:t>Can be used for</w:t>
+            </w:r>
+          </w:p>
+        </w:tc>
+        <w:tc>
+          <w:tcPr>
+            <w:tcW w:type="dxa" w:w="6526"/>
+            <w:shd w:val="clear" w:color="auto" w:fill="1F3864"/>
+          </w:tcPr>
+          <w:p>
+            <w:pPr>
+              <w:spacing w:before="40" w:after="40"/>
+            </w:pPr>
+            <w:r>
+              <w:rPr>
+                <w:b/>
+                <w:color w:val="FFFFFF"/>
+                <w:sz w:val="19"/>
+              </w:rPr>
+              <w:t>Shared with</w:t>
+            </w:r>
+          </w:p>
+        </w:tc>
+      </w:tr>
+      <w:tr>
+        <w:tc>
+          <w:tcPr>
+            <w:tcW w:type="dxa" w:w="900"/>
+          </w:tcPr>
+          <w:p>
+            <w:pPr>
+              <w:spacing w:before="20" w:after="20"/>
+            </w:pPr>
+            <w:r>
+              <w:rPr>
+                <w:sz w:val="19"/>
+              </w:rPr>
+              <w:t>35</w:t>
+            </w:r>
+          </w:p>
+        </w:tc>
+        <w:tc>
+          <w:tcPr>
+            <w:tcW w:type="dxa" w:w="1600"/>
+          </w:tcPr>
+          <w:p>
+            <w:pPr>
+              <w:spacing w:before="20" w:after="20"/>
+            </w:pPr>
+            <w:r>
+              <w:rPr>
+                <w:sz w:val="19"/>
+              </w:rPr>
+              <w:t>Equipment stop (default)</w:t>
+            </w:r>
+          </w:p>
+        </w:tc>
+        <w:tc>
+          <w:tcPr>
+            <w:tcW w:type="dxa" w:w="6526"/>
+          </w:tcPr>
+          <w:p>
+            <w:pPr>
+              <w:spacing w:before="20" w:after="20"/>
+            </w:pPr>
+            <w:r>
+              <w:rPr>
+                <w:sz w:val="19"/>
+              </w:rPr>
+              <w:t>MCP2515 INT</w:t>
+            </w:r>
+          </w:p>
+        </w:tc>
+      </w:tr>
+      <w:tr>
+        <w:tc>
+          <w:tcPr>
+            <w:tcW w:type="dxa" w:w="900"/>
+          </w:tcPr>
+          <w:p>
+            <w:pPr>
+              <w:spacing w:before="20" w:after="20"/>
+            </w:pPr>
+            <w:r>
+              <w:rPr>
+                <w:sz w:val="19"/>
+              </w:rPr>
+              <w:t>15</w:t>
+            </w:r>
+          </w:p>
+        </w:tc>
+        <w:tc>
+          <w:tcPr>
+            <w:tcW w:type="dxa" w:w="1600"/>
+          </w:tcPr>
+          <w:p>
+            <w:pPr>
+              <w:spacing w:before="20" w:after="20"/>
+            </w:pPr>
+            <w:r>
+              <w:rPr>
+                <w:sz w:val="19"/>
+              </w:rPr>
+              <w:t>2nd battery contactors (default) or equipment stop</w:t>
+            </w:r>
+          </w:p>
+        </w:tc>
+        <w:tc>
+          <w:tcPr>
+            <w:tcW w:type="dxa" w:w="6526"/>
+          </w:tcPr>
+          <w:p>
+            <w:pPr>
+              <w:spacing w:before="20" w:after="20"/>
+            </w:pPr>
+            <w:r>
+              <w:rPr>
+                <w:sz w:val="19"/>
+              </w:rPr>
+              <w:t>SD card CMD, ESP32 boot pin</w:t>
+            </w:r>
+          </w:p>
+        </w:tc>
+      </w:tr>
+      <w:tr>
+        <w:tc>
+          <w:tcPr>
+            <w:tcW w:type="dxa" w:w="900"/>
+          </w:tcPr>
+          <w:p>
+            <w:pPr>
+              <w:spacing w:before="20" w:after="20"/>
+            </w:pPr>
+            <w:r>
+              <w:rPr>
+                <w:sz w:val="19"/>
+              </w:rPr>
+              <w:t>14</w:t>
+            </w:r>
+          </w:p>
+        </w:tc>
+        <w:tc>
+          <w:tcPr>
+            <w:tcW w:type="dxa" w:w="1600"/>
+          </w:tcPr>
+          <w:p>
+            <w:pPr>
+              <w:spacing w:before="20" w:after="20"/>
+            </w:pPr>
+            <w:r>
+              <w:rPr>
+                <w:sz w:val="19"/>
+              </w:rPr>
+              <w:t>2nd battery contactors or equipment stop</w:t>
+            </w:r>
+          </w:p>
+        </w:tc>
+        <w:tc>
+          <w:tcPr>
+            <w:tcW w:type="dxa" w:w="6526"/>
+          </w:tcPr>
+          <w:p>
+            <w:pPr>
+              <w:spacing w:before="20" w:after="20"/>
+            </w:pPr>
+            <w:r>
+              <w:rPr>
+                <w:sz w:val="19"/>
+              </w:rPr>
+              <w:t>SD card CLK</w:t>
+            </w:r>
+          </w:p>
+        </w:tc>
+      </w:tr>
+    </w:tbl>
+    <w:p>
+      <w:pPr>
+        <w:pStyle w:val="ListParagraph"/>
+        <w:numPr>
+          <w:ilvl w:val="0"/>
+          <w:numId w:val="1"/>
+        </w:numPr>
+      </w:pPr>
+      <w:r>
+        <w:t>The firmware checks the pins again at every start. If the equipment stop pin cannot be used, the battery stays paused with an equipment stop event until the setting is fixed and the board restarted; resuming from the web page or MQTT does not release it. If the 2nd battery contactor pin cannot be used, that pin is never driven, battery 2 stays disconnected and a GPIO conflict error stops the system.</w:t>
+      </w:r>
+    </w:p>
+    <w:p>
+      <w:pPr>
+        <w:pStyle w:val="Note"/>
+      </w:pPr>
+      <w:r>
+        <w:t>Pins 14 and 15 are pulled high by the ESP32 for a moment at power-up and reset, before the firmware drives them low. The contactor driver (relay board or MOSFET stage) must not close a contactor on such a short pulse.</w:t>
+      </w:r>
+    </w:p>
+    <w:p>
+      <w:pPr>
         <w:pStyle w:val="Heading1"/>
       </w:pPr>
       <w:r>
@@ -9171,6 +9485,40 @@
                 <w:sz w:val="19"/>
               </w:rPr>
               <w:t>Cycle counters of battery 1 and 2, written by the driver</w:t>
+            </w:r>
+          </w:p>
+        </w:tc>
+      </w:tr>
+      <w:tr>
+        <w:tc>
+          <w:tcPr>
+            <w:tcW w:type="dxa" w:w="3000"/>
+          </w:tcPr>
+          <w:p>
+            <w:pPr>
+              <w:spacing w:before="20" w:after="20"/>
+            </w:pPr>
+            <w:r>
+              <w:rPr>
+                <w:sz w:val="19"/>
+              </w:rPr>
+              <w:t>GPIOOPT7, GPIOOPT8</w:t>
+            </w:r>
+          </w:p>
+        </w:tc>
+        <w:tc>
+          <w:tcPr>
+            <w:tcW w:type="dxa" w:w="6026"/>
+          </w:tcPr>
+          <w:p>
+            <w:pPr>
+              <w:spacing w:before="20" w:after="20"/>
+            </w:pPr>
+            <w:r>
+              <w:rPr>
+                <w:sz w:val="19"/>
+              </w:rPr>
+              <w:t>T-CAN485 only: 2nd battery contactor pin (0 = Pin 15, 1 = Pin 14) and equipment stop pin (0 = Pin 35, 1 = Pin 15, 2 = Pin 14)</w:t>
             </w:r>
           </w:p>
         </w:tc>

</xml_diff>

<commit_message>
LilyGo T-CAN485: settings page checks every shared pin, incl. MCP2518FD, BMS power and SMA enable
The page lists the pins each enabled feature claims at boot (CAN add-ons, GPIO contactors,
2nd battery contactors, BMS power, SMA enable, HIA4V1 precharge, equipment stop), greys out
taken choices in the four pin selects and refuses to save a pin claimed twice.
</commit_message>
<xml_diff>
--- a/JK-Active-Balancer-Manual-v13.docx
+++ b/JK-Active-Balancer-Manual-v13.docx
@@ -3011,7 +3011,19 @@
         </w:numPr>
       </w:pPr>
       <w:r>
-        <w:t>Pin 35 is also the interrupt of the MCP2515 CAN add-on. With the add-on in use, put the equipment stop on Pin 15 or Pin 14. The settings page does not offer a pin that is already taken and refuses to save a clash.</w:t>
+        <w:t>Pin 35 is also the interrupt of the MCP2515 and MCP2518FD CAN add-ons. With an add-on in use, put the equipment stop on Pin 15 or Pin 14.</w:t>
+      </w:r>
+    </w:p>
+    <w:p>
+      <w:pPr>
+        <w:pStyle w:val="ListParagraph"/>
+        <w:numPr>
+          <w:ilvl w:val="0"/>
+          <w:numId w:val="1"/>
+        </w:numPr>
+      </w:pPr>
+      <w:r>
+        <w:t>Other pins on this board have more than one user too: Pin 18 is BMS power or the add-on chip select, Pin 5 is the SMA enable input or the add-on data line, Pin 25 is BMS power or the precharge output, Pin 33 is the SMA enable input or the negative contactor. A pin claimed twice stops the system at boot with a GPIO conflict error, so the settings page greys out the choices that are taken and refuses to save a clash, naming both users.</w:t>
       </w:r>
     </w:p>
     <w:p>
@@ -3158,7 +3170,7 @@
               <w:rPr>
                 <w:sz w:val="19"/>
               </w:rPr>
-              <w:t>MCP2515 INT</w:t>
+              <w:t>MCP2515 / MCP2518FD INT</w:t>
             </w:r>
           </w:p>
         </w:tc>

</xml_diff>

<commit_message>
LilyGo T-CAN485: SMA enable input selectable on pin 15 or 14 too
SD logging is not started when the SMA enable uses pin 14/15, and the settings page treats
the new choices like the other shared pins.
</commit_message>
<xml_diff>
--- a/JK-Active-Balancer-Manual-v13.docx
+++ b/JK-Active-Balancer-Manual-v13.docx
@@ -3023,7 +3023,7 @@
         </w:numPr>
       </w:pPr>
       <w:r>
-        <w:t>Other pins on this board have more than one user too: Pin 18 is BMS power or the add-on chip select, Pin 5 is the SMA enable input or the add-on data line, Pin 25 is BMS power or the precharge output, Pin 33 is the SMA enable input or the negative contactor. A pin claimed twice stops the system at boot with a GPIO conflict error, so the settings page greys out the choices that are taken and refuses to save a clash, naming both users.</w:t>
+        <w:t>Other pins on this board have more than one user too: Pin 18 is BMS power or the add-on chip select, Pin 5 is the SMA enable input or the add-on data line, Pin 25 is BMS power or the precharge output, Pin 33 is the SMA enable input or the negative contactor. The SMA enable input can also go on Pin 15 or Pin 14 (Settings, Hardware config, SMA enable pin). A pin claimed twice stops the system at boot with a GPIO conflict error, so the settings page greys out the choices that are taken and refuses to save a clash, naming both users.</w:t>
       </w:r>
     </w:p>
     <w:p>
@@ -3035,7 +3035,7 @@
         </w:numPr>
       </w:pPr>
       <w:r>
-        <w:t>Pins 14 and 15 are also the SD card slot (CLK and CMD). While either of them drives the contactors or reads the stop, SD logging is not started and its settings are hidden.</w:t>
+        <w:t>Pins 14 and 15 are also the SD card slot (CLK and CMD). While either of them drives the contactors or reads the stop or the SMA enable input, SD logging is not started and its settings are hidden.</w:t>
       </w:r>
     </w:p>
     <w:p>
@@ -3204,7 +3204,7 @@
               <w:rPr>
                 <w:sz w:val="19"/>
               </w:rPr>
-              <w:t>2nd battery contactors (default) or equipment stop</w:t>
+              <w:t>2nd battery contactors (default), equipment stop or SMA enable input</w:t>
             </w:r>
           </w:p>
         </w:tc>
@@ -3254,7 +3254,7 @@
               <w:rPr>
                 <w:sz w:val="19"/>
               </w:rPr>
-              <w:t>2nd battery contactors or equipment stop</w:t>
+              <w:t>2nd battery contactors, equipment stop or SMA enable input</w:t>
             </w:r>
           </w:p>
         </w:tc>

</xml_diff>

<commit_message>
LilyGo T-CAN485: Pin 2 selectable for BMS power, 2nd battery contactors, equipment stop and SMA enable
Pin 2 (uSD DAT0) is free with a CAN add-on, which takes pin 18. BMS power on pin 2 is held
across a software/OTA restart like pin 25; SD logging is not started when pin 2 is in use.
</commit_message>
<xml_diff>
--- a/JK-Active-Balancer-Manual-v13.docx
+++ b/JK-Active-Balancer-Manual-v13.docx
@@ -2999,7 +2999,7 @@
         </w:numPr>
       </w:pPr>
       <w:r>
-        <w:t>2nd battery contactors: Pin 15 (default) or Pin 14. Equipment stop: Pin 35 (default), Pin 15 or Pin 14. Existing installations keep Pin 15 and Pin 35 after the update.</w:t>
+        <w:t>2nd battery contactors: Pin 15 (default), Pin 14 or Pin 2. Equipment stop: Pin 35 (default), Pin 15, Pin 14 or Pin 2. BMS power: Pin 18 (default), Pin 25 or Pin 2. SMA enable input: Pin 5 (default), Pin 33, Pin 15, Pin 14 or Pin 2. Existing installations keep their pins after the update.</w:t>
       </w:r>
     </w:p>
     <w:p>
@@ -3035,7 +3035,19 @@
         </w:numPr>
       </w:pPr>
       <w:r>
-        <w:t>Pins 14 and 15 are also the SD card slot (CLK and CMD). While either of them drives the contactors or reads the stop or the SMA enable input, SD logging is not started and its settings are hidden.</w:t>
+        <w:t>Pins 2, 14 and 15 are only reachable through the SD card slot (DAT0, CLK and CMD), with an SD breakout or wires to the slot. While any of them drives the contactors or BMS power or reads the stop or the SMA enable input, SD logging is not started and its settings are hidden.</w:t>
+      </w:r>
+    </w:p>
+    <w:p>
+      <w:pPr>
+        <w:pStyle w:val="ListParagraph"/>
+        <w:numPr>
+          <w:ilvl w:val="0"/>
+          <w:numId w:val="1"/>
+        </w:numPr>
+      </w:pPr>
+      <w:r>
+        <w:t>Pin 2 is an ESP32 boot pin. It is held low by the ESP32 during reset, so a contactor or BMS power driver on it gets no start-up pulse, and BMS power on Pin 2 is kept on through a software or OTA restart like Pin 25. If Pin 2 is HIGH while the board is reset into USB flashing mode, flashing over USB fails (normal starts and OTA are not affected): an equipment stop or SMA enable input on Pin 2 is HIGH in normal running, so press the stop or unplug the input to flash over USB. LilyGo publishes no schematic; measure on the unpowered board whether Pin 2 has a pull-up to 3.3 V on the SD lines (about 10 kOhm), in which case it is high at start-up like Pins 14 and 15.</w:t>
       </w:r>
     </w:p>
     <w:p>
@@ -3271,6 +3283,56 @@
                 <w:sz w:val="19"/>
               </w:rPr>
               <w:t>SD card CLK</w:t>
+            </w:r>
+          </w:p>
+        </w:tc>
+      </w:tr>
+      <w:tr>
+        <w:tc>
+          <w:tcPr>
+            <w:tcW w:type="dxa" w:w="900"/>
+          </w:tcPr>
+          <w:p>
+            <w:pPr>
+              <w:spacing w:before="20" w:after="20"/>
+            </w:pPr>
+            <w:r>
+              <w:rPr>
+                <w:sz w:val="19"/>
+              </w:rPr>
+              <w:t>2</w:t>
+            </w:r>
+          </w:p>
+        </w:tc>
+        <w:tc>
+          <w:tcPr>
+            <w:tcW w:type="dxa" w:w="1600"/>
+          </w:tcPr>
+          <w:p>
+            <w:pPr>
+              <w:spacing w:before="20" w:after="20"/>
+            </w:pPr>
+            <w:r>
+              <w:rPr>
+                <w:sz w:val="19"/>
+              </w:rPr>
+              <w:t>2nd battery contactors, BMS power, equipment stop or SMA enable input</w:t>
+            </w:r>
+          </w:p>
+        </w:tc>
+        <w:tc>
+          <w:tcPr>
+            <w:tcW w:type="dxa" w:w="6526"/>
+          </w:tcPr>
+          <w:p>
+            <w:pPr>
+              <w:spacing w:before="20" w:after="20"/>
+            </w:pPr>
+            <w:r>
+              <w:rPr>
+                <w:sz w:val="19"/>
+              </w:rPr>
+              <w:t>SD card DAT0, ESP32 boot pin</w:t>
             </w:r>
           </w:p>
         </w:tc>
@@ -9514,7 +9576,7 @@
               <w:rPr>
                 <w:sz w:val="19"/>
               </w:rPr>
-              <w:t>GPIOOPT7, GPIOOPT8</w:t>
+              <w:t>GPIOOPT2, GPIOOPT3, GPIOOPT7, GPIOOPT8</w:t>
             </w:r>
           </w:p>
         </w:tc>
@@ -9530,7 +9592,7 @@
               <w:rPr>
                 <w:sz w:val="19"/>
               </w:rPr>
-              <w:t>T-CAN485 only: 2nd battery contactor pin (0 = Pin 15, 1 = Pin 14) and equipment stop pin (0 = Pin 35, 1 = Pin 15, 2 = Pin 14)</w:t>
+              <w:t>T-CAN485 only: BMS power pin (0 = Pin 18, 1 = Pin 25, 2 = Pin 2), SMA enable pin (0 = Pin 5, 1 = Pin 33, 2 = Pin 15, 3 = Pin 14, 4 = Pin 2), 2nd battery contactor pin (0 = Pin 15, 1 = Pin 14, 2 = Pin 2) and equipment stop pin (0 = Pin 35, 1 = Pin 15, 2 = Pin 14, 3 = Pin 2)</w:t>
             </w:r>
           </w:p>
         </w:tc>

</xml_diff>

<commit_message>
JK: each pack requires its own GPIO contactor control
A balancer cannot disconnect the pack, so without Contactor control via GPIO (battery 1) or
the 2nd/3rd battery contactor control (battery 2/3) the pack is a config error (JK_CFG_NO_CONTACTOR):
not polled, JK_CONFIG_ERROR raised, system in FAULT. The settings page refuses to save a JK
battery without them. Manual and help text updated.
</commit_message>
<xml_diff>
--- a/JK-Active-Balancer-Manual-v13.docx
+++ b/JK-Active-Balancer-Manual-v13.docx
@@ -789,7 +789,7 @@
         </w:numPr>
       </w:pPr>
       <w:r>
-        <w:t>4. Open the web page (own access point or your router). Settings page: Battery = JK Active Balancer (CAB500), Battery CAN interface = the port with the balancers, Inverter and Inverter CAN interface, Contactor control on with your precharge time, WiFi credentials. Save.</w:t>
+        <w:t>4. Open the web page (own access point or your router). Settings page: Battery = JK Active Balancer (CAB500), Battery CAN interface = the port with the balancers, Inverter and Inverter CAN interface, Contactor control on with your precharge time, WiFi credentials. Save. Hardware config: tick Contactor control via GPIO, and for a 2nd or 3rd pack also 2nd / 3rd battery contactor control: a balancer cannot disconnect the pack itself, so the JK battery does not run without them and the Settings page refuses to save.</w:t>
       </w:r>
     </w:p>
     <w:p>
@@ -7033,7 +7033,7 @@
     </w:p>
     <w:p>
       <w:r>
-        <w:t>If the saved JK settings are inconsistent the driver does not poll, keeps the limits at 0 W, stays in FAULT so the contactors remain open, raises JK_CONFIG_ERROR (Data = code) and shows a red banner on More battery info. Codes: 1 bridge and low-voltage both on, 2 cells not a multiple of cells per balancer in low-voltage mode, 3 more than 15 balancers needed, 4 cell counts out of range, 5 firmware version not 1-3, 6 voltage limits out of order or pack min invalid, 7 SOC min not below SOC max. Correct the settings and reboot.</w:t>
+        <w:t>If the saved JK settings are inconsistent the driver does not poll, keeps the limits at 0 W, stays in FAULT so the contactors remain open, raises JK_CONFIG_ERROR (Data = code) and shows a red banner on More battery info. Codes: 1 bridge and low-voltage both on, 2 cells not a multiple of cells per balancer in low-voltage mode, 3 more than 15 balancers needed, 4 cell counts out of range, 5 firmware version not 1-3, 6 voltage limits out of order or pack min invalid, 7 SOC min not below SOC max, 8 no GPIO contactor control for this pack (Contactor control via GPIO for battery 1, 2nd or 3rd battery contactor control for battery 2 or 3). Correct the settings and reboot.</w:t>
       </w:r>
     </w:p>
     <w:p>

</xml_diff>